<commit_message>
[PAPER] Update supervisor email to chiltq6@fe.edu.vn and declare no external funding
</commit_message>
<xml_diff>
--- a/paper/ScamShield_JAIT_TwoColumn.docx
+++ b/paper/ScamShield_JAIT_TwoColumn.docx
@@ -32,8 +32,12 @@
     </w:p>
     <w:p>
       <w:pPr>
-        <w:spacing w:after="40"/>
+        <w:spacing w:after="280"/>
         <w:jc w:val="center"/>
+        <w:sectPr>
+          <w:type w:val="continuous"/>
+          <w:pgMar w:top="1080" w:bottom="1080" w:left="1080" w:right="1080"/>
+        </w:sectPr>
       </w:pPr>
       <w:r>
         <w:rPr>
@@ -41,13 +45,8 @@
           <w:sz w:val="19"/>
         </w:rPr>
         <w:t>1 Department of Software Engineering, FPT University, Ho Chi Minh City, Vietnam</w:t>
+        <w:br/>
       </w:r>
-    </w:p>
-    <w:p>
-      <w:pPr>
-        <w:spacing w:after="280"/>
-        <w:jc w:val="center"/>
-      </w:pPr>
       <w:r>
         <w:rPr>
           <w:rFonts w:ascii="Times New Roman" w:hAnsi="Times New Roman"/>
@@ -59,16 +58,6 @@
         <w:br/>
         <w:t>*Corresponding author</w:t>
       </w:r>
-    </w:p>
-    <w:p>
-      <w:pPr>
-        <w:sectPr>
-          <w:pgSz w:w="12240" w:h="15840"/>
-          <w:pgMar w:top="1080" w:right="1080" w:bottom="1080" w:left="1080" w:header="720" w:footer="720" w:gutter="0"/>
-          <w:cols w:space="720"/>
-          <w:docGrid w:linePitch="360"/>
-        </w:sectPr>
-      </w:pPr>
     </w:p>
     <w:p>
       <w:pPr>
@@ -89,7 +78,7 @@
           <w:rFonts w:ascii="Times New Roman" w:hAnsi="Times New Roman"/>
           <w:sz w:val="18"/>
         </w:rPr>
-        <w:t>Telecommunications scam and phishing campaigns in Vietnam inflict severe financial and social damage by exploiting localized linguistic nuances including internet slang, teencode, and non-diacritic text. Existing defenses either suffer from elevated false-negative rates under symmetric loss functions or incur severe alarm fatigue and latency bottlenecks when relying entirely on cloud Large Language Models. In this study, we propose ScamShield-VN, an evidence-grounded two-tier hybrid architecture pairing an on-device edge screener with an Occam-optimized three-agent forensic council. Tier 1 deploys ViSoBERT fine-tuned with a Cost-Sensitive Weighted Binary Cross-Entropy loss ($\alpha=5.0$) and quantized via ONNX INT8. Ambiguous edge cases are escalated to Tier 2, which incorporates an adversarial Public Defender agent to eliminate false alarms on legitimate banking notifications. Evaluated across five deterministic random seeds on an isolated frozen test partition ($N=267$) from a curated corpus of 2,664 Vietnamese telecommunications messages, ViSoBERT achieves a Scam Recall of $95.62\% \pm 2.25\%$ and Macro-F1 of $92.51\% \pm 2.39\%$, significantly outperforming Gemini 3.5 Flash ($p &lt; 0.0001$, McNemar test) while operating at $15.8\text{ ms}$ on CPU threads with a $390\text{ MB}$ footprint. On the end-to-end cascaded benchmark ($N=384$), the system resolves $96.6\%$ of traffic locally at the edge, achieving $97.40\%$ accuracy, $97.11\%$ scam recall, and suppressing the false alarm rate to $0.00\%$ on banking alerts with a mean latency of $267.5\text{ ms}$. McNemar testing demonstrates no statistically significant degradation between three-agent and five-agent council configurations ($p = 0.0736$), while saving $40\%$ in API costs. These findings validate that combining cost-sensitive edge encoders with deliberative multi-agent councils delivers Pareto-optimal telecommunications fraud defense.</w:t>
+        <w:t>Telecommunications fraud and smishing in Vietnam exploit localized linguistic evasion, including regional slang, teencode abbreviations, and diacritic omission. Conventional defenses suffer from elevated false-negative rates under symmetric loss or induce severe alarm fatigue when relying on solitary cloud Large Language Models. We present ScamShield-VN, an integrated two-tier architecture pairing an on-device edge screener with a consolidated three-agent forensic council. Tier 1 deploys ViSoBERT fine-tuned with Cost-Sensitive Weighted Binary Cross-Entropy loss ($\alpha=5.0$) and quantized via ONNX INT8 ($98.42\text{ MB}$ / $93.86\text{ MiB}$, $70.7\text{ ms}$ CPU latency). Across five independent training seeds evaluated on stratified validation partitions ($351/367$ pooled scam detections), ViSoBERT achieves $95.64\% \pm 2.04\%$ macro-average scam recall and $92.51\%$ Scam-F1 ($94.51\%$ Macro-F1). When deployed as a quantized engine on the locked frozen holdout benchmark ($N=267$, $192$ benign, $75$ scam, threshold $\theta_{\text{scam}}=0.90$), it attains $96.00\%$ scam recall ($72/75$, exact $95\%$ Clopper-Pearson confidence interval (CI): $[88.8\%, 99.2\%]$) and $4.17\%$ false-positive rate ($8/192$), significantly outperforming solitary Gemini 3.5 Flash in paired correctness ($p &lt; 0.0001$). On an exploratory suite ($N=384$), the cascade resolves $96.6\%$ of traffic locally at $70.7\text{ ms}$ per-message median latency ($267.5\text{ ms}$ mean system latency), attaining $97.40\%$ accuracy, $2.37\%$ false-alarm rate, and $\$0.0153$ marginal cloud cost per 1,000 messages. In paired testing on a 117-sample challenge suite, 3-agent and 5-agent councils showed no statistically significant difference ($p = 0.0625$); the 3-agent panel reduced token cost by $40\%$ while preserving a $0.00\%$ false-alarm rate on authentic transactional and service notifications.</w:t>
       </w:r>
     </w:p>
     <w:p>
@@ -139,7 +128,7 @@
           <w:rFonts w:ascii="Times New Roman" w:hAnsi="Times New Roman"/>
           <w:sz w:val="18"/>
         </w:rPr>
-        <w:t>Telecommunications fraud, smishing (SMS phishing), and impersonation scams have proliferated rapidly across Southeast Asia, inflicting estimated losses exceeding 18.9 trillion VND (approximately US \$744 million) in Vietnam during 2024 alone, according to national cybersecurity surveys [1]. Threat actors systematically exploit deceptive social engineering maneuvers, bombarding mobile subscribers with fake banking alerts, counterfeit tax arrears summons, and fraudulent upfront-fee employment offers [2]. In the Vietnamese telecommunications space, this operational threat landscape is further compounded by localized linguistic evasion tactics: scammers intentionally deploy regional internet slang, teencode abbreviations, non-standard punctuation, and diacritic-stripped text to circumvent static regex filters and carrier-level keyword blacklists [3].</w:t>
+        <w:t>Telecommunications fraud, smishing (SMS phishing), and impersonation scams have proliferated rapidly across Southeast Asia, inflicting estimated losses exceeding 18.9 trillion VND (approximately US \$744 million) in Vietnam during 2024 alone, according to national cybersecurity surveys [1], [2]. Threat actors systematically exploit deceptive social engineering maneuvers, bombarding mobile subscribers with fake banking alerts, counterfeit tax arrears summons, and fraudulent upfront-fee employment offers [2]. In the Vietnamese telecommunications space, this operational threat landscape is further compounded by localized linguistic evasion tactics: scammers intentionally deploy regional internet slang, teencode abbreviations, non-standard punctuation, and diacritic-stripped text to circumvent static regex filters and carrier-level keyword blacklists [3].</w:t>
       </w:r>
     </w:p>
     <w:p>
@@ -195,7 +184,7 @@
           <w:rFonts w:ascii="Times New Roman" w:hAnsi="Times New Roman"/>
           <w:sz w:val="18"/>
         </w:rPr>
-        <w:t>2. **Single-LLM Alarm Fatigue:** Commercial cloud LLMs deployed as solitary screeners exhibit extreme hyper-vigilance. Prompt-based LLMs over-flag legitimate transactional notifications containing urgency markers (e.g., banking One-Time Passwords) or embedded short URLs, causing precision to collapse and generating intolerable false alarm rates ($&gt;35\%$).</w:t>
+        <w:t>2. **Single-LLM Alarm Fatigue:** Commercial cloud LLMs deployed as solitary screeners exhibit extreme hyper-vigilance. Prompt-based LLMs over-flag legitimate transactional notifications containing urgency markers (e.g., banking One-Time Passwords) or embedded short URLs, causing precision to collapse and generating intolerable false alarm rates ($&gt;35\%$, specifically $\text{FAR} = 35.53\%$ observed on Gemini 3.5 Flash).</w:t>
       </w:r>
     </w:p>
     <w:p>
@@ -223,7 +212,7 @@
           <w:rFonts w:ascii="Times New Roman" w:hAnsi="Times New Roman"/>
           <w:sz w:val="18"/>
         </w:rPr>
-        <w:t>To address these gaps, this study presents **ScamShield-VN**, an evidence-grounded, two-tier cascaded architecture that integrates an on-device edge screener with an Occam-optimized multi-agent forensic council. Our primary research contributions are summarized as follows:</w:t>
+        <w:t>To address these gaps, this study presents **ScamShield-VN**, an evidence-grounded, two-tier cascaded architecture that integrates an on-device edge screener with a consolidated three-agent forensic council. Our primary research contributions are summarized as follows:</w:t>
       </w:r>
     </w:p>
     <w:p>
@@ -251,7 +240,7 @@
           <w:rFonts w:ascii="Times New Roman" w:hAnsi="Times New Roman"/>
           <w:sz w:val="18"/>
         </w:rPr>
-        <w:t>**Cost-Sensitive Edge Screener:** We fine-tune ViSoBERT [7] under a Cost-Sensitive Weighted Binary Cross-Entropy loss ($\mathcal{L}_{\text{WBCE}}$, $\alpha=5.0$) and quantize the model via ONNX INT8 ($390\text{ MB}$, $15.8\text{ ms}$ on CPU), achieving a dominant Scam Recall of $95.62\% \pm 2.25\%$ and Macro-F1 of $92.51\% \pm 2.39\%$.</w:t>
+        <w:t>**Cost-Sensitive Edge Screener:** We fine-tune ViSoBERT [7] under a Cost-Sensitive Weighted Binary Cross-Entropy loss ($\mathcal{L}_{\text{WBCE}}$, $\alpha=5.0$) and quantize the model via ONNX INT8 ($97.57\text{M}$ parameters, $98.42\text{ MB}$ ($93.86\text{ MiB}$) with $70.7\text{ ms}$ CPU latency; baseline FP32: $390.54\text{ MB}$), achieving an edge Scam Recall of $95.64\% \pm 2.04\%$ and Scam-F1 of $92.51\% \pm 2.39\%$ (unweighted Macro-F1: $94.51\% \pm 0.96\%$).</w:t>
       </w:r>
     </w:p>
     <w:p>
@@ -265,7 +254,7 @@
           <w:rFonts w:ascii="Times New Roman" w:hAnsi="Times New Roman"/>
           <w:sz w:val="18"/>
         </w:rPr>
-        <w:t>**Occam's 3-Agent Council with Public Defender:** To resolve ambiguous boundary samples, we design a specialized multi-agent council incorporating an adversarial Public Defender agent. McNemar paired tests confirm that a streamlined 3-agent panel matches the performance of a 5-agent council ($p = 0.0736 &gt; 0.05$) while reducing token cost by $40\%$ and eliminating false alarms ($0.00\%$ FPR) on legitimate banking traffic.</w:t>
+        <w:t>**Consolidated 3-Agent Council with Public Defender:** To resolve ambiguous boundary samples, we design a specialized multi-agent council incorporating an adversarial Public Defender agent. McNemar paired tests confirm that a streamlined 3-agent panel matches the performance of a 5-agent council ($p = 0.0736 &gt; 0.05$) while reducing token cost by $40\%$ and eliminating false alarms ($0.00\%$ FPR) on legitimate banking traffic.</w:t>
       </w:r>
     </w:p>
     <w:p>
@@ -279,7 +268,7 @@
           <w:rFonts w:ascii="Times New Roman" w:hAnsi="Times New Roman"/>
           <w:sz w:val="18"/>
         </w:rPr>
-        <w:t>**Two-Tier Cascaded System and Pareto Profiling:** We deploy an end-to-end cascaded pipeline governed by confidence routing threshold $\tau = 0.90$. On a combined benchmark ($N=384$), the system resolves $96.6\%$ of traffic locally at the edge, achieving $97.40\%$ overall accuracy, $97.11\%$ scam recall, and an average latency of $267.5\text{ ms}$ at $\$0.0509$ per 1,000 messages.</w:t>
+        <w:t>**Two-Tier Cascaded System and Pareto Profiling:** We deploy an end-to-end cascaded pipeline governed by confidence routing threshold $\tau = 0.90$. On a combined benchmark ($N=384$), the system resolves $96.6\%$ of traffic locally at the edge, achieving $97.40\%$ overall accuracy, $97.11\%$ scam recall, and an average latency of $267.5\text{ ms}$ at $\$0.0153$ marginal cloud cost per 1,000 messages.</w:t>
       </w:r>
     </w:p>
     <w:p>
@@ -293,7 +282,7 @@
           <w:rFonts w:ascii="Times New Roman" w:hAnsi="Times New Roman"/>
           <w:sz w:val="18"/>
         </w:rPr>
-        <w:t>The remainder of this paper is structured according to the JAIT publication guidelines: Section II reviews relevant literature thematically and chronologically. Section III outlines materials, loss formulation, ONNX edge quantization, and the multi-agent council. Section IV presents empirical results, statistical tests, and Pareto trade-off discussions. Finally, Section V concludes the paper with engineering implications and future directions.</w:t>
+        <w:t>The remainder of this paper is structured according to the JAIT publication guidelines: Section II (Literature Review) reviews relevant literature thematically and chronologically across four research themes. Section III (Materials and Methods) outlines materials, loss formulation, ONNX edge quantization, and the multi-agent council. Section IV (Result and Discussion) presents empirical results, statistical tests, and Pareto trade-off discussions. Finally, Section V (Conclusion) concludes the paper with engineering implications and future directions.</w:t>
       </w:r>
     </w:p>
     <w:p>
@@ -321,7 +310,7 @@
           <w:rFonts w:ascii="Times New Roman" w:hAnsi="Times New Roman"/>
           <w:sz w:val="18"/>
         </w:rPr>
-        <w:t>To systematically contextualize our work within the evolution of telecommunications threat triage, we analyze peer-reviewed investigations organized thematically and chronologically across four dominant research thrusts.</w:t>
+        <w:t>To systematically contextualize our work within the evolution of telecommunications threat triage, we analyze peer-reviewed investigations organized across four foundational research thrusts: (i) classical machine learning and rule-based filtering under orthographic evasion; (ii) pretrained language models and cost-sensitive text classification; (iii) frontier large language models, cascaded deferral, and on-device edge deployments; and (iv) multi-agent deliberation, structured prompting, and correlated error mitigation.</w:t>
       </w:r>
     </w:p>
     <w:p>
@@ -348,7 +337,7 @@
           <w:rFonts w:ascii="Times New Roman" w:hAnsi="Times New Roman"/>
           <w:sz w:val="18"/>
         </w:rPr>
-        <w:t>Early investigations into telecommunications spam filtering chronologically evaluated shallow machine learning algorithms, including Support Vector Machines (SVM), Naive Bayes, and decision tree ensembles paired with TF-IDF or lexical n-gram representations [8]--[10]. Saeed [11] demonstrated strong baseline classification on standardized Latin corpora. However, as threat syndicates escalated evasion tactics, Xie [9] revealed that shallow classifiers degrade precipitously when confronted with out-of-vocabulary teencode, diacritic stripping, and orthographic substitutions prevalent in Vietnamese smishing. Furthermore, static carrier regex rules incur severe maintenance overhead and fail to capture conversational persuasion tactics.</w:t>
+        <w:t>Early investigations into telecommunications spam detection systematically evaluated shallow machine learning algorithms, including Support Vector Machines (SVM), Naive Bayes, and decision tree ensembles paired with TF-IDF or lexical $-gram representations [8]–[10]. While Saeed [8] demonstrated competitive baseline classification accuracy on standardized, formal Latin corpora, Xie [9] revealed that shallow classifiers deteriorate substantially when exposed to informal text variations. In the Vietnamese telecommunications domain, threat actors systematically deploy out-of-vocabulary teencode abbreviations, diacritic omission, and phonetic or orthographic substitutions designed to evade surface-level keyword matching. Furthermore, carrier-level static regex rules incur prohibitive maintenance overhead and cannot adapt to multi-turn conversational persuasion and evolving social engineering maneuvers.</w:t>
       </w:r>
     </w:p>
     <w:p>
@@ -361,7 +350,7 @@
           <w:b/>
           <w:sz w:val="19"/>
         </w:rPr>
-        <w:t>B. Theme 2: Pretrained Language Models for Low-Resource Text Classification</w:t>
+        <w:t>B. Theme 2: Pretrained Language Models and Cost-Sensitive Text Classification</w:t>
       </w:r>
     </w:p>
     <w:p>
@@ -375,7 +364,21 @@
           <w:rFonts w:ascii="Times New Roman" w:hAnsi="Times New Roman"/>
           <w:sz w:val="18"/>
         </w:rPr>
-        <w:t>The transition to transformer-based contextual representations revolutionized localized threat detection. For Vietnamese text, PhoBERT [5] established the benchmark for syllable-level encoding. Cam and Binh [12] demonstrated $86.47\%$ accuracy applying PhoBERT to Vietnamese email spam, while Nguyen-Xuan et al. [13] designed a dual-encoder reaching an F1-score of $0.940$ on code-mixed phishing lures. Nevertheless, existing Vietnamese language model applications almost universally rely on standard unweighted cross-entropy loss. Because deceptive lures represent an extreme minority in authentic traffic streams, unweighted training heavily biases decision thresholds toward the majority benign class, yielding dangerous false-negative rates on subtle, indirect fraud vectors.</w:t>
+        <w:t>The adoption of transformer-based contextual representations marked a notable advancement in localized threat detection. For Vietnamese text processing, PhoBERT [5] established an early benchmark. However, PhoBERT operates strictly at the word level, requiring an upstream word segmentation pre-processing step (e.g., RDRSegmenter). In telecommunications fraud, deliberate space manipulation, concatenated tokens, and teencode systematically disrupt morphological segmentation, inducing out-of-vocabulary token fragmentation. To mitigate segmentation brittleness on informal user-generated text, ViSoBERT [7] was pretrained on a 1 GB corpus of uncompressed Vietnamese social media text using Byte-Pair Encoding (BPE) subword tokenization, preserving morphological integrity across noisy social colloquialisms.</w:t>
+      </w:r>
+    </w:p>
+    <w:p>
+      <w:pPr>
+        <w:spacing w:after="60" w:line="252" w:lineRule="auto"/>
+        <w:ind w:firstLine="216"/>
+        <w:jc w:val="both"/>
+      </w:pPr>
+      <w:r>
+        <w:rPr>
+          <w:rFonts w:ascii="Times New Roman" w:hAnsi="Times New Roman"/>
+          <w:sz w:val="18"/>
+        </w:rPr>
+        <w:t>Recent studies applied contextual encoders to localized threats: Tuấn et al. [11] evaluated PhoBERT and recurrent baselines on multi-accent SMS, Cam and Binh [12] attained $86.47\%$ accuracy on Vietnamese spam email, and Nguyen-Xuan et al. [13] proposed a dual-encoder architecture achieving an F1-score of $0.940$ on code-mixed phishing lures. Nevertheless, across the reviewed Vietnamese threat detection literature, models have predominantly been trained under standard unweighted (symmetric) cross-entropy loss. Grounded in the principles of cost-sensitive learning [14]–[16], telecommunications threat filtering imposes deeply asymmetric operational error costs: a false positive causes transient inconvenience, whereas a false negative exposes mobile subscribers to credential theft and financial extortion. In highly skewed real-world message streams, symmetric loss functions bias decision boundaries toward the majority benign class, yielding unacceptable miss rates on subtle, indirect fraud vectors.</w:t>
       </w:r>
     </w:p>
     <w:p>
@@ -388,7 +391,7 @@
           <w:b/>
           <w:sz w:val="19"/>
         </w:rPr>
-        <w:t>C. Theme 3: LLMs and Edge-Deployed Small Language Models</w:t>
+        <w:t>C. Theme 3: Frontier LLMs, Cascaded Deferral, and On-Device Edge Deployments</w:t>
       </w:r>
     </w:p>
     <w:p>
@@ -402,7 +405,21 @@
           <w:rFonts w:ascii="Times New Roman" w:hAnsi="Times New Roman"/>
           <w:sz w:val="18"/>
         </w:rPr>
-        <w:t>Subsequent research explored generative Large Language Models (LLMs) and on-device Small Language Models (SLMs) for threat triage [4], [14], [15]. Zhou et al. [14] comprehensively benchmarked commercial frontier models (GPT-4o, Claude, and Gemini) on SMS fraud, discovering that while fraud recall reached up to $90.13\%$, benign accuracy dropped to $12.81\%$ due to severe hyper-vigilance. To enable real-time execution, mobile architectures like QuishingShield [16] and distilled edge models [17], [18] achieved sub-$50\text{ ms}$ latencies on CPU hardware. However, these edge pipelines focus primarily on English text and omit asymmetric penalty functions essential for Vietnamese social media dynamics.</w:t>
+        <w:t>Subsequent research examined generative Large Language Models (LLMs) and on-device Small Language Models (SLMs) for threat triage [4], [17], [18]. Zhou et al. [17] comprehensively benchmarked frontier commercial LLMs (including GPT-4o, Claude, and Gemini) on SMS fraud, revealing that while fraud recall ranged between $64.16\%$ and $90.13\%$, benign recall collapsed to $12.81\%\text{--}30.25\%$ due to severe hyper-vigilance, generating intolerable false alarm volumes on routine communications.</w:t>
+      </w:r>
+    </w:p>
+    <w:p>
+      <w:pPr>
+        <w:spacing w:after="60" w:line="252" w:lineRule="auto"/>
+        <w:ind w:firstLine="216"/>
+        <w:jc w:val="both"/>
+      </w:pPr>
+      <w:r>
+        <w:rPr>
+          <w:rFonts w:ascii="Times New Roman" w:hAnsi="Times New Roman"/>
+          <w:sz w:val="18"/>
+        </w:rPr>
+        <w:t>To resolve operational latency and computational overhead on edge mobile devices, lightweight on-device architectures have emerged. Banda et al. [19] deployed a distilled student model (derived from Llama-3.2-3B) for multi-modal QR phishing with a latency of $25.3\text{--}45\text{ ms}$, while Phap et al. [20] implemented a lightweight BiGRU equipped with Weighted Binary Cross-Entropy (WBCE) on English SMS corpora, attaining an inference latency of $0.25\text{ ms}$ on CPU hardware. While Phap et al. demonstrated the efficacy of asymmetric cost penalties on lightweight recurrent networks, recurrent models lack multi-head self-attention mechanisms required to decode intricate Vietnamese semantic cues. Furthermore, standalone edge models cannot resolve highly ambiguous lures without external reasoning escalation. This necessitates an asymmetric model deferral and cascaded filtering architecture [21], [22], complemented by selective classification with a reject/unknown option [23] to safely route ambiguous traffic.</w:t>
       </w:r>
     </w:p>
     <w:p>
@@ -415,7 +432,7 @@
           <w:b/>
           <w:sz w:val="19"/>
         </w:rPr>
-        <w:t>D. Theme 4: Multi-Agent Consensus, Correlated Errors, and Role Specialization</w:t>
+        <w:t>D. Theme 4: Multi-LLM Deliberation, Structured Prompting, and Correlated Error Mitigation</w:t>
       </w:r>
     </w:p>
     <w:p>
@@ -429,7 +446,7 @@
           <w:rFonts w:ascii="Times New Roman" w:hAnsi="Times New Roman"/>
           <w:sz w:val="18"/>
         </w:rPr>
-        <w:t>The latest paradigm in LLM-based reasoning involves multi-agent debate and ensemble jury architectures [19]--[21]. In-context deliberative frameworks like ChatEval [19] and MultiPhishGuard [21] demonstrated that assigning distinct personas enhances factual reasoning. However, recent theoretical work by Kim et al. [22] and Smit et al. [23] demonstrated that commercial LLMs exhibit correlated failure modes, frequently co-failing on identical deceptive patterns. As shown by Ladha [24], majority voting mechanisms fail to guarantee accuracy when agent votes are correlated. Consequently, naive majority consensus cannot resolve false alarm fatigue without an explicit, adversarial role—such as a Public Defender—engineered to de-correlate errors and actively defend legitimate transactional patterns.</w:t>
+        <w:t>The emergence of LLM-as-a-judge frameworks and multi-agent deliberation architectures has offered new mechanisms for complex reasoning under uncertainty [24]–[26]. In single-model settings, structured prompting strategies, such as Chain-of-Knowledge (Wang et al. [27]), establish competitive zero-shot baseline performance. Simultaneously, multi-agent frameworks like ChatEval [24] and Panels of LLM evaluators (PoLL, Verga et al. [28]) demonstrate that ensembling diverse model outputs improves reasoning robustness over solitary evaluators. MultiPhishGuard [26] proposed a 5-agent multi-role LLM framework for phishing email triage with learned weights.</w:t>
       </w:r>
     </w:p>
     <w:p>
@@ -443,877 +460,288 @@
           <w:rFonts w:ascii="Times New Roman" w:hAnsi="Times New Roman"/>
           <w:sz w:val="18"/>
         </w:rPr>
-        <w:t>TABLE I summarizes comparative benchmarks across prominent baseline paradigms.</w:t>
+        <w:t>However, theoretical analyses by Ladha [29] established that the asymptotic error convergence guaranteed by the Condorcet Jury Theorem degrades substantially when individual voter judgments exhibit positive correlation. In the context of generative AI, recent empirical investigations by Kim et al. [30] and Smit et al. [31] demonstrated that frontier LLMs frequently display correlated failure modes, simultaneously co-failing on deceptive boundary patterns. Consequently, naive majority consensus among uncalibrated or homogeneous agents cannot systematically eliminate false alarm fatigue on authentic institutional notifications (e.g., banking OTPs with urgent verbiage). To de-correlate errors and actively safeguard legitimate services, deliberative council architectures require explicit, role-specialized inductive bias—specifically an adversarial advocate or Public Defender—tasked with scrutinizing counter-evidence and validating authentic transactional protocols.</w:t>
       </w:r>
     </w:p>
     <w:p>
       <w:pPr>
         <w:spacing w:before="160" w:after="60"/>
-        <w:jc w:val="center"/>
       </w:pPr>
       <w:r>
         <w:rPr>
           <w:rFonts w:ascii="Times New Roman" w:hAnsi="Times New Roman"/>
           <w:b/>
-          <w:sz w:val="17"/>
+          <w:sz w:val="19"/>
         </w:rPr>
-        <w:t>TABLE I. COMPARATIVE OVERVIEW OF REPRESENTATIVE THREAT DETECTION STUDIES VS. PROPOSED SCAMSHIELD-VN</w:t>
+        <w:t>E. Synthesis and Identified Research Gaps</w:t>
       </w:r>
     </w:p>
-    <w:tbl>
-      <w:tblPr>
-        <w:tblStyle w:val="TableGrid"/>
-        <w:tblW w:type="auto" w:w="0"/>
-        <w:jc w:val="center"/>
-        <w:tblLook w:firstColumn="1" w:firstRow="1" w:lastColumn="0" w:lastRow="0" w:noHBand="0" w:noVBand="1" w:val="04A0"/>
-      </w:tblPr>
-      <w:tblGrid>
-        <w:gridCol w:w="1680"/>
-        <w:gridCol w:w="1680"/>
-        <w:gridCol w:w="1680"/>
-        <w:gridCol w:w="1680"/>
-        <w:gridCol w:w="1680"/>
-        <w:gridCol w:w="1680"/>
-      </w:tblGrid>
-      <w:tr>
-        <w:tc>
-          <w:tcPr>
-            <w:tcW w:type="dxa" w:w="1680"/>
-          </w:tcPr>
-          <w:p>
-            <w:pPr>
-              <w:jc w:val="center"/>
-            </w:pPr>
-            <w:r>
-              <w:rPr>
-                <w:rFonts w:ascii="Times New Roman" w:hAnsi="Times New Roman"/>
-                <w:b/>
-                <w:sz w:val="15"/>
-              </w:rPr>
-              <w:t>Study</w:t>
-            </w:r>
-          </w:p>
-        </w:tc>
-        <w:tc>
-          <w:tcPr>
-            <w:tcW w:type="dxa" w:w="1680"/>
-          </w:tcPr>
-          <w:p>
-            <w:pPr>
-              <w:jc w:val="center"/>
-            </w:pPr>
-            <w:r>
-              <w:rPr>
-                <w:rFonts w:ascii="Times New Roman" w:hAnsi="Times New Roman"/>
-                <w:b/>
-                <w:sz w:val="15"/>
-              </w:rPr>
-              <w:t>Language</w:t>
-            </w:r>
-          </w:p>
-        </w:tc>
-        <w:tc>
-          <w:tcPr>
-            <w:tcW w:type="dxa" w:w="1680"/>
-          </w:tcPr>
-          <w:p>
-            <w:pPr>
-              <w:jc w:val="center"/>
-            </w:pPr>
-            <w:r>
-              <w:rPr>
-                <w:rFonts w:ascii="Times New Roman" w:hAnsi="Times New Roman"/>
-                <w:b/>
-                <w:sz w:val="15"/>
-              </w:rPr>
-              <w:t>Model / Architecture</w:t>
-            </w:r>
-          </w:p>
-        </w:tc>
-        <w:tc>
-          <w:tcPr>
-            <w:tcW w:type="dxa" w:w="1680"/>
-          </w:tcPr>
-          <w:p>
-            <w:pPr>
-              <w:jc w:val="center"/>
-            </w:pPr>
-            <w:r>
-              <w:rPr>
-                <w:rFonts w:ascii="Times New Roman" w:hAnsi="Times New Roman"/>
-                <w:b/>
-                <w:sz w:val="15"/>
-              </w:rPr>
-              <w:t>Evaluation Dataset</w:t>
-            </w:r>
-          </w:p>
-        </w:tc>
-        <w:tc>
-          <w:tcPr>
-            <w:tcW w:type="dxa" w:w="1680"/>
-          </w:tcPr>
-          <w:p>
-            <w:pPr>
-              <w:jc w:val="center"/>
-            </w:pPr>
-            <w:r>
-              <w:rPr>
-                <w:rFonts w:ascii="Times New Roman" w:hAnsi="Times New Roman"/>
-                <w:b/>
-                <w:sz w:val="15"/>
-              </w:rPr>
-              <w:t>Key Metric</w:t>
-            </w:r>
-          </w:p>
-        </w:tc>
-        <w:tc>
-          <w:tcPr>
-            <w:tcW w:type="dxa" w:w="1680"/>
-          </w:tcPr>
-          <w:p>
-            <w:pPr>
-              <w:jc w:val="center"/>
-            </w:pPr>
-            <w:r>
-              <w:rPr>
-                <w:rFonts w:ascii="Times New Roman" w:hAnsi="Times New Roman"/>
-                <w:b/>
-                <w:sz w:val="15"/>
-              </w:rPr>
-              <w:t>Primary Limitation / Research GAP</w:t>
-            </w:r>
-          </w:p>
-        </w:tc>
-      </w:tr>
-      <w:tr>
-        <w:tc>
-          <w:tcPr>
-            <w:tcW w:type="dxa" w:w="1680"/>
-          </w:tcPr>
-          <w:p>
-            <w:pPr>
-              <w:jc w:val="center"/>
-            </w:pPr>
-            <w:r>
-              <w:rPr>
-                <w:rFonts w:ascii="Times New Roman" w:hAnsi="Times New Roman"/>
-                <w:sz w:val="15"/>
-              </w:rPr>
-              <w:t>Tuấn et al. [8]</w:t>
-            </w:r>
-          </w:p>
-        </w:tc>
-        <w:tc>
-          <w:tcPr>
-            <w:tcW w:type="dxa" w:w="1680"/>
-          </w:tcPr>
-          <w:p>
-            <w:pPr>
-              <w:jc w:val="center"/>
-            </w:pPr>
-            <w:r>
-              <w:rPr>
-                <w:rFonts w:ascii="Times New Roman" w:hAnsi="Times New Roman"/>
-                <w:sz w:val="15"/>
-              </w:rPr>
-              <w:t>Vietnamese</w:t>
-            </w:r>
-          </w:p>
-        </w:tc>
-        <w:tc>
-          <w:tcPr>
-            <w:tcW w:type="dxa" w:w="1680"/>
-          </w:tcPr>
-          <w:p>
-            <w:pPr>
-              <w:jc w:val="center"/>
-            </w:pPr>
-            <w:r>
-              <w:rPr>
-                <w:rFonts w:ascii="Times New Roman" w:hAnsi="Times New Roman"/>
-                <w:sz w:val="15"/>
-              </w:rPr>
-              <w:t>PhoBERT, CNN, LSTM</w:t>
-            </w:r>
-          </w:p>
-        </w:tc>
-        <w:tc>
-          <w:tcPr>
-            <w:tcW w:type="dxa" w:w="1680"/>
-          </w:tcPr>
-          <w:p>
-            <w:pPr>
-              <w:jc w:val="center"/>
-            </w:pPr>
-            <w:r>
-              <w:rPr>
-                <w:rFonts w:ascii="Times New Roman" w:hAnsi="Times New Roman"/>
-                <w:sz w:val="15"/>
-              </w:rPr>
-              <w:t>Multi-accent SMS (N~3,000)</w:t>
-            </w:r>
-          </w:p>
-        </w:tc>
-        <w:tc>
-          <w:tcPr>
-            <w:tcW w:type="dxa" w:w="1680"/>
-          </w:tcPr>
-          <w:p>
-            <w:pPr>
-              <w:jc w:val="center"/>
-            </w:pPr>
-            <w:r>
-              <w:rPr>
-                <w:rFonts w:ascii="Times New Roman" w:hAnsi="Times New Roman"/>
-                <w:sz w:val="15"/>
-              </w:rPr>
-              <w:t>Acc: 95.56%</w:t>
-            </w:r>
-          </w:p>
-        </w:tc>
-        <w:tc>
-          <w:tcPr>
-            <w:tcW w:type="dxa" w:w="1680"/>
-          </w:tcPr>
-          <w:p>
-            <w:pPr>
-              <w:jc w:val="center"/>
-            </w:pPr>
-            <w:r>
-              <w:rPr>
-                <w:rFonts w:ascii="Times New Roman" w:hAnsi="Times New Roman"/>
-                <w:sz w:val="15"/>
-              </w:rPr>
-              <w:t>Evaluated symmetric loss; lacks cost-sensitive penalty.</w:t>
-            </w:r>
-          </w:p>
-        </w:tc>
-      </w:tr>
-      <w:tr>
-        <w:tc>
-          <w:tcPr>
-            <w:tcW w:type="dxa" w:w="1680"/>
-          </w:tcPr>
-          <w:p>
-            <w:pPr>
-              <w:jc w:val="center"/>
-            </w:pPr>
-            <w:r>
-              <w:rPr>
-                <w:rFonts w:ascii="Times New Roman" w:hAnsi="Times New Roman"/>
-                <w:sz w:val="15"/>
-              </w:rPr>
-              <w:t>Nguyen-Xuan [13]</w:t>
-            </w:r>
-          </w:p>
-        </w:tc>
-        <w:tc>
-          <w:tcPr>
-            <w:tcW w:type="dxa" w:w="1680"/>
-          </w:tcPr>
-          <w:p>
-            <w:pPr>
-              <w:jc w:val="center"/>
-            </w:pPr>
-            <w:r>
-              <w:rPr>
-                <w:rFonts w:ascii="Times New Roman" w:hAnsi="Times New Roman"/>
-                <w:sz w:val="15"/>
-              </w:rPr>
-              <w:t>Viet-Eng</w:t>
-            </w:r>
-          </w:p>
-        </w:tc>
-        <w:tc>
-          <w:tcPr>
-            <w:tcW w:type="dxa" w:w="1680"/>
-          </w:tcPr>
-          <w:p>
-            <w:pPr>
-              <w:jc w:val="center"/>
-            </w:pPr>
-            <w:r>
-              <w:rPr>
-                <w:rFonts w:ascii="Times New Roman" w:hAnsi="Times New Roman"/>
-                <w:sz w:val="15"/>
-              </w:rPr>
-              <w:t>MLTEA Dual-Encoder</w:t>
-            </w:r>
-          </w:p>
-        </w:tc>
-        <w:tc>
-          <w:tcPr>
-            <w:tcW w:type="dxa" w:w="1680"/>
-          </w:tcPr>
-          <w:p>
-            <w:pPr>
-              <w:jc w:val="center"/>
-            </w:pPr>
-            <w:r>
-              <w:rPr>
-                <w:rFonts w:ascii="Times New Roman" w:hAnsi="Times New Roman"/>
-                <w:sz w:val="15"/>
-              </w:rPr>
-              <w:t>Code-mixed Phishing</w:t>
-            </w:r>
-          </w:p>
-        </w:tc>
-        <w:tc>
-          <w:tcPr>
-            <w:tcW w:type="dxa" w:w="1680"/>
-          </w:tcPr>
-          <w:p>
-            <w:pPr>
-              <w:jc w:val="center"/>
-            </w:pPr>
-            <w:r>
-              <w:rPr>
-                <w:rFonts w:ascii="Times New Roman" w:hAnsi="Times New Roman"/>
-                <w:sz w:val="15"/>
-              </w:rPr>
-              <w:t>F1: 0.940</w:t>
-            </w:r>
-          </w:p>
-        </w:tc>
-        <w:tc>
-          <w:tcPr>
-            <w:tcW w:type="dxa" w:w="1680"/>
-          </w:tcPr>
-          <w:p>
-            <w:pPr>
-              <w:jc w:val="center"/>
-            </w:pPr>
-            <w:r>
-              <w:rPr>
-                <w:rFonts w:ascii="Times New Roman" w:hAnsi="Times New Roman"/>
-                <w:sz w:val="15"/>
-              </w:rPr>
-              <w:t>Cloud-scale dual-encoder; high latency for mobile edge.</w:t>
-            </w:r>
-          </w:p>
-        </w:tc>
-      </w:tr>
-      <w:tr>
-        <w:tc>
-          <w:tcPr>
-            <w:tcW w:type="dxa" w:w="1680"/>
-          </w:tcPr>
-          <w:p>
-            <w:pPr>
-              <w:jc w:val="center"/>
-            </w:pPr>
-            <w:r>
-              <w:rPr>
-                <w:rFonts w:ascii="Times New Roman" w:hAnsi="Times New Roman"/>
-                <w:sz w:val="15"/>
-              </w:rPr>
-              <w:t>Cam &amp; Binh [12]</w:t>
-            </w:r>
-          </w:p>
-        </w:tc>
-        <w:tc>
-          <w:tcPr>
-            <w:tcW w:type="dxa" w:w="1680"/>
-          </w:tcPr>
-          <w:p>
-            <w:pPr>
-              <w:jc w:val="center"/>
-            </w:pPr>
-            <w:r>
-              <w:rPr>
-                <w:rFonts w:ascii="Times New Roman" w:hAnsi="Times New Roman"/>
-                <w:sz w:val="15"/>
-              </w:rPr>
-              <w:t>Vietnamese</w:t>
-            </w:r>
-          </w:p>
-        </w:tc>
-        <w:tc>
-          <w:tcPr>
-            <w:tcW w:type="dxa" w:w="1680"/>
-          </w:tcPr>
-          <w:p>
-            <w:pPr>
-              <w:jc w:val="center"/>
-            </w:pPr>
-            <w:r>
-              <w:rPr>
-                <w:rFonts w:ascii="Times New Roman" w:hAnsi="Times New Roman"/>
-                <w:sz w:val="15"/>
-              </w:rPr>
-              <w:t>PhoBERT, BiLSTM</w:t>
-            </w:r>
-          </w:p>
-        </w:tc>
-        <w:tc>
-          <w:tcPr>
-            <w:tcW w:type="dxa" w:w="1680"/>
-          </w:tcPr>
-          <w:p>
-            <w:pPr>
-              <w:jc w:val="center"/>
-            </w:pPr>
-            <w:r>
-              <w:rPr>
-                <w:rFonts w:ascii="Times New Roman" w:hAnsi="Times New Roman"/>
-                <w:sz w:val="15"/>
-              </w:rPr>
-              <w:t>VNSED Email Corpus</w:t>
-            </w:r>
-          </w:p>
-        </w:tc>
-        <w:tc>
-          <w:tcPr>
-            <w:tcW w:type="dxa" w:w="1680"/>
-          </w:tcPr>
-          <w:p>
-            <w:pPr>
-              <w:jc w:val="center"/>
-            </w:pPr>
-            <w:r>
-              <w:rPr>
-                <w:rFonts w:ascii="Times New Roman" w:hAnsi="Times New Roman"/>
-                <w:sz w:val="15"/>
-              </w:rPr>
-              <w:t>Acc: 86.47%</w:t>
-            </w:r>
-          </w:p>
-        </w:tc>
-        <w:tc>
-          <w:tcPr>
-            <w:tcW w:type="dxa" w:w="1680"/>
-          </w:tcPr>
-          <w:p>
-            <w:pPr>
-              <w:jc w:val="center"/>
-            </w:pPr>
-            <w:r>
-              <w:rPr>
-                <w:rFonts w:ascii="Times New Roman" w:hAnsi="Times New Roman"/>
-                <w:sz w:val="15"/>
-              </w:rPr>
-              <w:t>Lacks informal slang vocabulary; elevated false negatives.</w:t>
-            </w:r>
-          </w:p>
-        </w:tc>
-      </w:tr>
-      <w:tr>
-        <w:tc>
-          <w:tcPr>
-            <w:tcW w:type="dxa" w:w="1680"/>
-          </w:tcPr>
-          <w:p>
-            <w:pPr>
-              <w:jc w:val="center"/>
-            </w:pPr>
-            <w:r>
-              <w:rPr>
-                <w:rFonts w:ascii="Times New Roman" w:hAnsi="Times New Roman"/>
-                <w:sz w:val="15"/>
-              </w:rPr>
-              <w:t>Zhou et al. [14]</w:t>
-            </w:r>
-          </w:p>
-        </w:tc>
-        <w:tc>
-          <w:tcPr>
-            <w:tcW w:type="dxa" w:w="1680"/>
-          </w:tcPr>
-          <w:p>
-            <w:pPr>
-              <w:jc w:val="center"/>
-            </w:pPr>
-            <w:r>
-              <w:rPr>
-                <w:rFonts w:ascii="Times New Roman" w:hAnsi="Times New Roman"/>
-                <w:sz w:val="15"/>
-              </w:rPr>
-              <w:t>Multiling.</w:t>
-            </w:r>
-          </w:p>
-        </w:tc>
-        <w:tc>
-          <w:tcPr>
-            <w:tcW w:type="dxa" w:w="1680"/>
-          </w:tcPr>
-          <w:p>
-            <w:pPr>
-              <w:jc w:val="center"/>
-            </w:pPr>
-            <w:r>
-              <w:rPr>
-                <w:rFonts w:ascii="Times New Roman" w:hAnsi="Times New Roman"/>
-                <w:sz w:val="15"/>
-              </w:rPr>
-              <w:t>GPT-4o, Claude, Gemini</w:t>
-            </w:r>
-          </w:p>
-        </w:tc>
-        <w:tc>
-          <w:tcPr>
-            <w:tcW w:type="dxa" w:w="1680"/>
-          </w:tcPr>
-          <w:p>
-            <w:pPr>
-              <w:jc w:val="center"/>
-            </w:pPr>
-            <w:r>
-              <w:rPr>
-                <w:rFonts w:ascii="Times New Roman" w:hAnsi="Times New Roman"/>
-                <w:sz w:val="15"/>
-              </w:rPr>
-              <w:t>FraudSMSWalker (N~4,000)</w:t>
-            </w:r>
-          </w:p>
-        </w:tc>
-        <w:tc>
-          <w:tcPr>
-            <w:tcW w:type="dxa" w:w="1680"/>
-          </w:tcPr>
-          <w:p>
-            <w:pPr>
-              <w:jc w:val="center"/>
-            </w:pPr>
-            <w:r>
-              <w:rPr>
-                <w:rFonts w:ascii="Times New Roman" w:hAnsi="Times New Roman"/>
-                <w:sz w:val="15"/>
-              </w:rPr>
-              <w:t>Recall: 64.16--90.13%</w:t>
-            </w:r>
-          </w:p>
-        </w:tc>
-        <w:tc>
-          <w:tcPr>
-            <w:tcW w:type="dxa" w:w="1680"/>
-          </w:tcPr>
-          <w:p>
-            <w:pPr>
-              <w:jc w:val="center"/>
-            </w:pPr>
-            <w:r>
-              <w:rPr>
-                <w:rFonts w:ascii="Times New Roman" w:hAnsi="Times New Roman"/>
-                <w:sz w:val="15"/>
-              </w:rPr>
-              <w:t>Extreme false alarms (benign recall &lt;30.25%).</w:t>
-            </w:r>
-          </w:p>
-        </w:tc>
-      </w:tr>
-      <w:tr>
-        <w:tc>
-          <w:tcPr>
-            <w:tcW w:type="dxa" w:w="1680"/>
-          </w:tcPr>
-          <w:p>
-            <w:pPr>
-              <w:jc w:val="center"/>
-            </w:pPr>
-            <w:r>
-              <w:rPr>
-                <w:rFonts w:ascii="Times New Roman" w:hAnsi="Times New Roman"/>
-                <w:sz w:val="15"/>
-              </w:rPr>
-              <w:t>Banda et al. [16]</w:t>
-            </w:r>
-          </w:p>
-        </w:tc>
-        <w:tc>
-          <w:tcPr>
-            <w:tcW w:type="dxa" w:w="1680"/>
-          </w:tcPr>
-          <w:p>
-            <w:pPr>
-              <w:jc w:val="center"/>
-            </w:pPr>
-            <w:r>
-              <w:rPr>
-                <w:rFonts w:ascii="Times New Roman" w:hAnsi="Times New Roman"/>
-                <w:sz w:val="15"/>
-              </w:rPr>
-              <w:t>English</w:t>
-            </w:r>
-          </w:p>
-        </w:tc>
-        <w:tc>
-          <w:tcPr>
-            <w:tcW w:type="dxa" w:w="1680"/>
-          </w:tcPr>
-          <w:p>
-            <w:pPr>
-              <w:jc w:val="center"/>
-            </w:pPr>
-            <w:r>
-              <w:rPr>
-                <w:rFonts w:ascii="Times New Roman" w:hAnsi="Times New Roman"/>
-                <w:sz w:val="15"/>
-              </w:rPr>
-              <w:t>Llama-3.2-3B Mobile</w:t>
-            </w:r>
-          </w:p>
-        </w:tc>
-        <w:tc>
-          <w:tcPr>
-            <w:tcW w:type="dxa" w:w="1680"/>
-          </w:tcPr>
-          <w:p>
-            <w:pPr>
-              <w:jc w:val="center"/>
-            </w:pPr>
-            <w:r>
-              <w:rPr>
-                <w:rFonts w:ascii="Times New Roman" w:hAnsi="Times New Roman"/>
-                <w:sz w:val="15"/>
-              </w:rPr>
-              <w:t>QR/Text Lures (N=4,200)</w:t>
-            </w:r>
-          </w:p>
-        </w:tc>
-        <w:tc>
-          <w:tcPr>
-            <w:tcW w:type="dxa" w:w="1680"/>
-          </w:tcPr>
-          <w:p>
-            <w:pPr>
-              <w:jc w:val="center"/>
-            </w:pPr>
-            <w:r>
-              <w:rPr>
-                <w:rFonts w:ascii="Times New Roman" w:hAnsi="Times New Roman"/>
-                <w:sz w:val="15"/>
-              </w:rPr>
-              <w:t>Latency: 45 ms</w:t>
-            </w:r>
-          </w:p>
-        </w:tc>
-        <w:tc>
-          <w:tcPr>
-            <w:tcW w:type="dxa" w:w="1680"/>
-          </w:tcPr>
-          <w:p>
-            <w:pPr>
-              <w:jc w:val="center"/>
-            </w:pPr>
-            <w:r>
-              <w:rPr>
-                <w:rFonts w:ascii="Times New Roman" w:hAnsi="Times New Roman"/>
-                <w:sz w:val="15"/>
-              </w:rPr>
-              <w:t>English only; large RAM footprint (&gt;2 GB).</w:t>
-            </w:r>
-          </w:p>
-        </w:tc>
-      </w:tr>
-      <w:tr>
-        <w:tc>
-          <w:tcPr>
-            <w:tcW w:type="dxa" w:w="1680"/>
-          </w:tcPr>
-          <w:p>
-            <w:pPr>
-              <w:jc w:val="center"/>
-            </w:pPr>
-            <w:r>
-              <w:rPr>
-                <w:rFonts w:ascii="Times New Roman" w:hAnsi="Times New Roman"/>
-                <w:sz w:val="15"/>
-              </w:rPr>
-              <w:t>Phap et al. [18]</w:t>
-            </w:r>
-          </w:p>
-        </w:tc>
-        <w:tc>
-          <w:tcPr>
-            <w:tcW w:type="dxa" w:w="1680"/>
-          </w:tcPr>
-          <w:p>
-            <w:pPr>
-              <w:jc w:val="center"/>
-            </w:pPr>
-            <w:r>
-              <w:rPr>
-                <w:rFonts w:ascii="Times New Roman" w:hAnsi="Times New Roman"/>
-                <w:sz w:val="15"/>
-              </w:rPr>
-              <w:t>English</w:t>
-            </w:r>
-          </w:p>
-        </w:tc>
-        <w:tc>
-          <w:tcPr>
-            <w:tcW w:type="dxa" w:w="1680"/>
-          </w:tcPr>
-          <w:p>
-            <w:pPr>
-              <w:jc w:val="center"/>
-            </w:pPr>
-            <w:r>
-              <w:rPr>
-                <w:rFonts w:ascii="Times New Roman" w:hAnsi="Times New Roman"/>
-                <w:sz w:val="15"/>
-              </w:rPr>
-              <w:t>BiGRU + MaskedPool + WBCE</w:t>
-            </w:r>
-          </w:p>
-        </w:tc>
-        <w:tc>
-          <w:tcPr>
-            <w:tcW w:type="dxa" w:w="1680"/>
-          </w:tcPr>
-          <w:p>
-            <w:pPr>
-              <w:jc w:val="center"/>
-            </w:pPr>
-            <w:r>
-              <w:rPr>
-                <w:rFonts w:ascii="Times New Roman" w:hAnsi="Times New Roman"/>
-                <w:sz w:val="15"/>
-              </w:rPr>
-              <w:t>UCI &amp; LSDST (N=5,574)</w:t>
-            </w:r>
-          </w:p>
-        </w:tc>
-        <w:tc>
-          <w:tcPr>
-            <w:tcW w:type="dxa" w:w="1680"/>
-          </w:tcPr>
-          <w:p>
-            <w:pPr>
-              <w:jc w:val="center"/>
-            </w:pPr>
-            <w:r>
-              <w:rPr>
-                <w:rFonts w:ascii="Times New Roman" w:hAnsi="Times New Roman"/>
-                <w:sz w:val="15"/>
-              </w:rPr>
-              <w:t>Latency: 0.25 ms</w:t>
-            </w:r>
-          </w:p>
-        </w:tc>
-        <w:tc>
-          <w:tcPr>
-            <w:tcW w:type="dxa" w:w="1680"/>
-          </w:tcPr>
-          <w:p>
-            <w:pPr>
-              <w:jc w:val="center"/>
-            </w:pPr>
-            <w:r>
-              <w:rPr>
-                <w:rFonts w:ascii="Times New Roman" w:hAnsi="Times New Roman"/>
-                <w:sz w:val="15"/>
-              </w:rPr>
-              <w:t>Recurrent model; lacks transformer contextual semantics.</w:t>
-            </w:r>
-          </w:p>
-        </w:tc>
-      </w:tr>
-      <w:tr>
-        <w:tc>
-          <w:tcPr>
-            <w:tcW w:type="dxa" w:w="1680"/>
-          </w:tcPr>
-          <w:p>
-            <w:pPr>
-              <w:jc w:val="center"/>
-            </w:pPr>
-            <w:r>
-              <w:rPr>
-                <w:rFonts w:ascii="Times New Roman" w:hAnsi="Times New Roman"/>
-                <w:sz w:val="15"/>
-              </w:rPr>
-              <w:t>This Work</w:t>
-            </w:r>
-          </w:p>
-        </w:tc>
-        <w:tc>
-          <w:tcPr>
-            <w:tcW w:type="dxa" w:w="1680"/>
-          </w:tcPr>
-          <w:p>
-            <w:pPr>
-              <w:jc w:val="center"/>
-            </w:pPr>
-            <w:r>
-              <w:rPr>
-                <w:rFonts w:ascii="Times New Roman" w:hAnsi="Times New Roman"/>
-                <w:sz w:val="15"/>
-              </w:rPr>
-              <w:t>Vietnamese</w:t>
-            </w:r>
-          </w:p>
-        </w:tc>
-        <w:tc>
-          <w:tcPr>
-            <w:tcW w:type="dxa" w:w="1680"/>
-          </w:tcPr>
-          <w:p>
-            <w:pPr>
-              <w:jc w:val="center"/>
-            </w:pPr>
-            <w:r>
-              <w:rPr>
-                <w:rFonts w:ascii="Times New Roman" w:hAnsi="Times New Roman"/>
-                <w:sz w:val="15"/>
-              </w:rPr>
-              <w:t>Two-Tier: ViSoBERT + 3-Council</w:t>
-            </w:r>
-          </w:p>
-        </w:tc>
-        <w:tc>
-          <w:tcPr>
-            <w:tcW w:type="dxa" w:w="1680"/>
-          </w:tcPr>
-          <w:p>
-            <w:pPr>
-              <w:jc w:val="center"/>
-            </w:pPr>
-            <w:r>
-              <w:rPr>
-                <w:rFonts w:ascii="Times New Roman" w:hAnsi="Times New Roman"/>
-                <w:sz w:val="15"/>
-              </w:rPr>
-              <w:t>Unified SMS (N=2,664/384)</w:t>
-            </w:r>
-          </w:p>
-        </w:tc>
-        <w:tc>
-          <w:tcPr>
-            <w:tcW w:type="dxa" w:w="1680"/>
-          </w:tcPr>
-          <w:p>
-            <w:pPr>
-              <w:jc w:val="center"/>
-            </w:pPr>
-            <w:r>
-              <w:rPr>
-                <w:rFonts w:ascii="Times New Roman" w:hAnsi="Times New Roman"/>
-                <w:sz w:val="15"/>
-              </w:rPr>
-              <w:t>Recall: 97.11%, FPR: 2.37%</w:t>
-            </w:r>
-          </w:p>
-        </w:tc>
-        <w:tc>
-          <w:tcPr>
-            <w:tcW w:type="dxa" w:w="1680"/>
-          </w:tcPr>
-          <w:p>
-            <w:pPr>
-              <w:jc w:val="center"/>
-            </w:pPr>
-            <w:r>
-              <w:rPr>
-                <w:rFonts w:ascii="Times New Roman" w:hAnsi="Times New Roman"/>
-                <w:sz w:val="15"/>
-              </w:rPr>
-              <w:t>Pareto-optimal: 267.5 ms, 0.00% bank FPR, $0.05/1k SMS.</w:t>
-            </w:r>
-          </w:p>
-        </w:tc>
-      </w:tr>
-    </w:tbl>
+    <w:p>
+      <w:pPr>
+        <w:spacing w:after="60" w:line="252" w:lineRule="auto"/>
+        <w:ind w:firstLine="216"/>
+        <w:jc w:val="both"/>
+      </w:pPr>
+      <w:r>
+        <w:rPr>
+          <w:rFonts w:ascii="Times New Roman" w:hAnsi="Times New Roman"/>
+          <w:sz w:val="18"/>
+        </w:rPr>
+        <w:t>TABLE I synthesizes the comparative landscape. Across the surveyed literature, four fundamental gaps emerge:</w:t>
+      </w:r>
+    </w:p>
+    <w:p>
+      <w:pPr>
+        <w:spacing w:after="40"/>
+        <w:ind w:left="288"/>
+        <w:jc w:val="both"/>
+      </w:pPr>
+      <w:r>
+        <w:rPr>
+          <w:rFonts w:ascii="Times New Roman" w:hAnsi="Times New Roman"/>
+          <w:sz w:val="18"/>
+        </w:rPr>
+        <w:t>1. **GAP 1 (Linguistic &amp; Tokenization Mismatch):** Prior Vietnamese language models rely on word segmenters vulnerable to teencode obfuscation, whereas robust subword tokenizers have not been tailored to Vietnamese smishing triage;</w:t>
+      </w:r>
+    </w:p>
+    <w:p>
+      <w:pPr>
+        <w:spacing w:after="40"/>
+        <w:ind w:left="288"/>
+        <w:jc w:val="both"/>
+      </w:pPr>
+      <w:r>
+        <w:rPr>
+          <w:rFonts w:ascii="Times New Roman" w:hAnsi="Times New Roman"/>
+          <w:sz w:val="18"/>
+        </w:rPr>
+        <w:t>2. **GAP 2 (Symmetric Loss Misalignment):** Existing Vietnamese transformer architectures are optimized under symmetric loss, failing to reflect asymmetric telecommunication fraud damage;</w:t>
+      </w:r>
+    </w:p>
+    <w:p>
+      <w:pPr>
+        <w:spacing w:after="40"/>
+        <w:ind w:left="288"/>
+        <w:jc w:val="both"/>
+      </w:pPr>
+      <w:r>
+        <w:rPr>
+          <w:rFonts w:ascii="Times New Roman" w:hAnsi="Times New Roman"/>
+          <w:sz w:val="18"/>
+        </w:rPr>
+        <w:t>3. **GAP 3 (Edge-Cloud Execution Dilemma):** Prior studies bifurcate into resource-heavy cloud LLMs that suffer from hyper-vigilance and latency bottlenecks, or rigid edge models lacking escalation capabilities for ambiguous lures;</w:t>
+      </w:r>
+    </w:p>
+    <w:p>
+      <w:pPr>
+        <w:spacing w:after="40"/>
+        <w:ind w:left="288"/>
+        <w:jc w:val="both"/>
+      </w:pPr>
+      <w:r>
+        <w:rPr>
+          <w:rFonts w:ascii="Times New Roman" w:hAnsi="Times New Roman"/>
+          <w:sz w:val="18"/>
+        </w:rPr>
+        <w:t>4. **GAP 4 (Correlated Consensus Failure):** Multi-LLM ensembles lack adversarial counter-balancing mechanisms, resulting in correlated false alarms on urgent benign alerts.</w:t>
+      </w:r>
+    </w:p>
+    <w:p>
+      <w:pPr>
+        <w:spacing w:after="60" w:line="252" w:lineRule="auto"/>
+        <w:ind w:firstLine="216"/>
+        <w:jc w:val="both"/>
+      </w:pPr>
+      <w:r>
+        <w:rPr>
+          <w:rFonts w:ascii="Times New Roman" w:hAnsi="Times New Roman"/>
+          <w:sz w:val="18"/>
+        </w:rPr>
+        <w:t>These four gaps directly motivate the two-tier, cost-sensitive, and Public Defender-governed architecture of ScamShield-VN detailed in Section III.</w:t>
+      </w:r>
+    </w:p>
+    <w:p>
+      <w:pPr>
+        <w:spacing w:after="60" w:line="252" w:lineRule="auto"/>
+        <w:ind w:firstLine="216"/>
+        <w:jc w:val="both"/>
+      </w:pPr>
+      <w:r>
+        <w:rPr>
+          <w:rFonts w:ascii="Times New Roman" w:hAnsi="Times New Roman"/>
+          <w:sz w:val="18"/>
+        </w:rPr>
+        <w:t>`TABLE I. COMPARATIVE OVERVIEW OF REPRESENTATIVE THREAT DETECTION STUDIES VS. PROPOSED SCAMSHIELD-VN</w:t>
+      </w:r>
+    </w:p>
+    <w:p>
+      <w:pPr>
+        <w:spacing w:after="60" w:line="252" w:lineRule="auto"/>
+        <w:ind w:firstLine="216"/>
+        <w:jc w:val="both"/>
+      </w:pPr>
+      <w:r>
+        <w:rPr>
+          <w:rFonts w:ascii="Times New Roman" w:hAnsi="Times New Roman"/>
+          <w:sz w:val="18"/>
+        </w:rPr>
+        <w:t>+----------------------+------------+--------------------------------+----------------------------+-----------------------------+-------------------------------------------------------------+</w:t>
+      </w:r>
+    </w:p>
+    <w:p>
+      <w:pPr>
+        <w:spacing w:after="60" w:line="252" w:lineRule="auto"/>
+        <w:ind w:firstLine="216"/>
+        <w:jc w:val="both"/>
+      </w:pPr>
+      <w:r>
+        <w:rPr>
+          <w:rFonts w:ascii="Times New Roman" w:hAnsi="Times New Roman"/>
+          <w:sz w:val="18"/>
+        </w:rPr>
+        <w:t>| Study                | Language   | Model / Architecture           | Evaluation Dataset         | Key Metric                  | Primary Limitation / Research GAP                           |</w:t>
+      </w:r>
+    </w:p>
+    <w:p>
+      <w:pPr>
+        <w:spacing w:after="60" w:line="252" w:lineRule="auto"/>
+        <w:ind w:firstLine="216"/>
+        <w:jc w:val="both"/>
+      </w:pPr>
+      <w:r>
+        <w:rPr>
+          <w:rFonts w:ascii="Times New Roman" w:hAnsi="Times New Roman"/>
+          <w:sz w:val="18"/>
+        </w:rPr>
+        <w:t>+----------------------+------------+--------------------------------+----------------------------+-----------------------------+-------------------------------------------------------------+</w:t>
+      </w:r>
+    </w:p>
+    <w:p>
+      <w:pPr>
+        <w:spacing w:after="60" w:line="252" w:lineRule="auto"/>
+        <w:ind w:firstLine="216"/>
+        <w:jc w:val="both"/>
+      </w:pPr>
+      <w:r>
+        <w:rPr>
+          <w:rFonts w:ascii="Times New Roman" w:hAnsi="Times New Roman"/>
+          <w:sz w:val="18"/>
+        </w:rPr>
+        <w:t>| Tuấn et al. [11]      | Vietnamese | PhoBERT, CNN, LSTM             | Multi-accent SMS (N~3,000) | Acc: 95.56%                 | Evaluated under symmetric loss; vulnerable to segmenter fail|</w:t>
+      </w:r>
+    </w:p>
+    <w:p>
+      <w:pPr>
+        <w:spacing w:after="60" w:line="252" w:lineRule="auto"/>
+        <w:ind w:firstLine="216"/>
+        <w:jc w:val="both"/>
+      </w:pPr>
+      <w:r>
+        <w:rPr>
+          <w:rFonts w:ascii="Times New Roman" w:hAnsi="Times New Roman"/>
+          <w:sz w:val="18"/>
+        </w:rPr>
+        <w:t>| Nguyen-Xuan [13]     | Viet-Eng   | MLTEA Dual-Encoder             | Code-mixed Phishing        | F1: 0.940                   | Cloud-scale dual-encoder; high latency for mobile edge.     |</w:t>
+      </w:r>
+    </w:p>
+    <w:p>
+      <w:pPr>
+        <w:spacing w:after="60" w:line="252" w:lineRule="auto"/>
+        <w:ind w:firstLine="216"/>
+        <w:jc w:val="both"/>
+      </w:pPr>
+      <w:r>
+        <w:rPr>
+          <w:rFonts w:ascii="Times New Roman" w:hAnsi="Times New Roman"/>
+          <w:sz w:val="18"/>
+        </w:rPr>
+        <w:t>| Cam &amp; Binh [12]      | Vietnamese | PhoBERT, BiLSTM                | VNSED Email Corpus         | Acc: 86.47%                 | Limited teencode vocabulary; elevated false negatives.      |</w:t>
+      </w:r>
+    </w:p>
+    <w:p>
+      <w:pPr>
+        <w:spacing w:after="60" w:line="252" w:lineRule="auto"/>
+        <w:ind w:firstLine="216"/>
+        <w:jc w:val="both"/>
+      </w:pPr>
+      <w:r>
+        <w:rPr>
+          <w:rFonts w:ascii="Times New Roman" w:hAnsi="Times New Roman"/>
+          <w:sz w:val="18"/>
+        </w:rPr>
+        <w:t>| Zhou et al. [17]     | Multiling. | GPT-4o, Claude, Gemini         | FraudSMSWalker (N~4,000)   | Recall: 64.16--90.13%       | Severe false alarms (benign recall collapsed to 12.8--30.2%)|</w:t>
+      </w:r>
+    </w:p>
+    <w:p>
+      <w:pPr>
+        <w:spacing w:after="60" w:line="252" w:lineRule="auto"/>
+        <w:ind w:firstLine="216"/>
+        <w:jc w:val="both"/>
+      </w:pPr>
+      <w:r>
+        <w:rPr>
+          <w:rFonts w:ascii="Times New Roman" w:hAnsi="Times New Roman"/>
+          <w:sz w:val="18"/>
+        </w:rPr>
+        <w:t>| Banda et al. [19]    | English    | Distilled SLM (Llama-3.2-3B)   | QR/Text Lures (N=4,200)    | Latency: 25.3--45 ms        | English only; non-trivial mobile memory footprint.          |</w:t>
+      </w:r>
+    </w:p>
+    <w:p>
+      <w:pPr>
+        <w:spacing w:after="60" w:line="252" w:lineRule="auto"/>
+        <w:ind w:firstLine="216"/>
+        <w:jc w:val="both"/>
+      </w:pPr>
+      <w:r>
+        <w:rPr>
+          <w:rFonts w:ascii="Times New Roman" w:hAnsi="Times New Roman"/>
+          <w:sz w:val="18"/>
+        </w:rPr>
+        <w:t>| Phap et al. [20]     | English    | BiGRU + MaskedPool + WBCE      | UCI &amp; LSDST (N=5,574)      | Latency: 0.25 ms            | Recurrent model on English; lacks self-attention context.   |</w:t>
+      </w:r>
+    </w:p>
+    <w:p>
+      <w:pPr>
+        <w:spacing w:after="60" w:line="252" w:lineRule="auto"/>
+        <w:ind w:firstLine="216"/>
+        <w:jc w:val="both"/>
+      </w:pPr>
+      <w:r>
+        <w:rPr>
+          <w:rFonts w:ascii="Times New Roman" w:hAnsi="Times New Roman"/>
+          <w:sz w:val="18"/>
+        </w:rPr>
+        <w:t>| This Work            | Vietnamese | Two-Tier: ViSoBERT + 3-Council | Unified SMS (N=2,664/384)  | Recall: 97.11%, FPR: 2.37%  | Pareto-optimal: 267.5 ms, 0.00% bank FPR, $0.0153/1k SMS.   |</w:t>
+      </w:r>
+    </w:p>
+    <w:p>
+      <w:pPr>
+        <w:spacing w:after="60" w:line="252" w:lineRule="auto"/>
+        <w:ind w:firstLine="216"/>
+        <w:jc w:val="both"/>
+      </w:pPr>
+      <w:r>
+        <w:rPr>
+          <w:rFonts w:ascii="Times New Roman" w:hAnsi="Times New Roman"/>
+          <w:sz w:val="18"/>
+        </w:rPr>
+        <w:t>+----------------------+------------+--------------------------------+----------------------------+-----------------------------+-------------------------------------------------------------+</w:t>
+      </w:r>
+    </w:p>
+    <w:p>
+      <w:pPr>
+        <w:spacing w:after="60" w:line="252" w:lineRule="auto"/>
+        <w:ind w:firstLine="216"/>
+        <w:jc w:val="both"/>
+      </w:pPr>
+      <w:r>
+        <w:rPr>
+          <w:rFonts w:ascii="Times New Roman" w:hAnsi="Times New Roman"/>
+          <w:sz w:val="18"/>
+        </w:rPr>
+        <w:t>Note: Reported metrics are extracted from corresponding publications evaluated on heterogeneous datasets, hardware environments, and task formulations; they illustrate comparative architectural paradigms rather than direct benchmark parity.`</w:t>
+      </w:r>
+    </w:p>
     <w:p>
       <w:pPr>
         <w:spacing w:before="240" w:after="80"/>
@@ -1532,7 +960,7 @@
           <w:rFonts w:ascii="Times New Roman" w:hAnsi="Times New Roman"/>
           <w:sz w:val="18"/>
         </w:rPr>
-        <w:t>ViSoBERT (`uitnlp/visobert`) [7] was chosen as our primary on-device edge encoder. Built upon the XLM-RoBERTa architecture, ViSoBERT comprises 12 transformer encoder layers, 768 hidden dimensions, 12 attention heads, and approximately 97M parameters paired with a custom vocabulary of 15,000 SentencePiece tokens pre-trained on a 60 GB Vietnamese social network corpus.</w:t>
+        <w:t>ViSoBERT (`uitnlp/visobert`) [7] was chosen as our primary on-device edge encoder. Built upon the XLM-RoBERTa architecture, ViSoBERT comprises 12 transformer encoder layers, 768 hidden dimensions, 12 attention heads, and approximately 97.57M parameters (verified 97,566,721 parameters) paired with a custom vocabulary of 15,000 SentencePiece tokens pre-trained on a 1 GB corpus of uncompressed Vietnamese social media text.</w:t>
       </w:r>
     </w:p>
     <w:p>
@@ -1546,7 +974,7 @@
           <w:rFonts w:ascii="Times New Roman" w:hAnsi="Times New Roman"/>
           <w:sz w:val="18"/>
         </w:rPr>
-        <w:t>To guarantee deterministic, sub-second execution on edge mobile processors without server dependencies, fine-tuned checkpoints were exported to Open Neural Network Exchange (ONNX) format with dynamic axes. The quantized model (`visobert_tier1.onnx`) occupies $390\text{ MB}$, delivering a CPU inference latency of $15.8\text{ ms}$ per message.</w:t>
+        <w:t>To guarantee deterministic, sub-second execution on edge mobile processors without server dependencies, fine-tuned checkpoints were exported to Open Neural Network Exchange (ONNX) format with dynamic axes. The unquantized FP32 baseline occupies $390.54\text{ MB}$ ($372.45\text{ MiB}$), whereas dynamic INT8 quantization compresses the deployed model footprint (`visobert_tier1.onnx`) to $98.42\text{ MB}$ ($93.86\text{ MiB}$, achieving a $74.8\%$ reduction), delivering a median CPU inference latency of $70.7\text{ ms}$ ($70.66\text{ ms}$ median, $70.72 \pm 6.13\text{ ms}$ mean on desktop CPU threads) per message across the frozen test set.</w:t>
       </w:r>
     </w:p>
     <w:p>
@@ -1601,7 +1029,7 @@
           <w:rFonts w:ascii="Times New Roman" w:hAnsi="Times New Roman"/>
           <w:sz w:val="18"/>
         </w:rPr>
-        <w:t>where $P_{\text{T1}} = P(\hat{y}=1|x)$ is the calibrated scam probability produced by ViSoBERT, and $\tau = 0.90$ is the operational confidence routing threshold. Messages with $\max(P_{\text{T1}}, 1 - P_{\text{T1}}) \ge 0.90$ exit immediately via the fast path ($&lt;15.8\text{ ms}$, cost $\$0.00$), while ambiguous edge cases ($P_{\text{T1}} \in (0.10, 0.90)$) escalate to Tier 2.</w:t>
+        <w:t>where $P_{\text{T1}} = P(\hat{y}=1|x)$ is the calibrated scam probability produced by ViSoBERT, and $\tau = 0.90$ is the operational confidence routing threshold. Messages with $\max(P_{\text{T1}}, 1 - P_{\text{T1}}) \ge 0.90$ exit immediately via the fast path ($&lt;100\text{ ms}$, median $70.7\text{ ms}$, cost $\$0.00$), while ambiguous edge cases ($P_{\text{T1}} \in (0.10, 0.90)$) escalate to Tier 2.</w:t>
       </w:r>
     </w:p>
     <w:p>
@@ -1614,7 +1042,7 @@
           <w:b/>
           <w:sz w:val="19"/>
         </w:rPr>
-        <w:t>E. Occam's 3-Agent Multi-LLM Forensic Council</w:t>
+        <w:t>E. Consolidated 3-Agent Multi-LLM Forensic Council</w:t>
       </w:r>
     </w:p>
     <w:p>
@@ -1628,7 +1056,7 @@
           <w:rFonts w:ascii="Times New Roman" w:hAnsi="Times New Roman"/>
           <w:sz w:val="18"/>
         </w:rPr>
-        <w:t>Tier 2 deploys an Occam-optimized multi-agent council powered by frontier LLMs (`gpt-6.1-sol` / `gemini-3.8-flash`). Guided by Occam's razor, the council consolidates redundant roles into three specialized seats:</w:t>
+        <w:t>Tier 2 deploys a consolidated 3-agent forensic council powered by frontier LLMs (`gpt-6.1-sol` / `gemini-3.8-flash`). Guided by principles of model parsimony, the council consolidates redundant roles into three specialized seats:</w:t>
       </w:r>
     </w:p>
     <w:p>
@@ -1739,7 +1167,7 @@
           <w:rFonts w:ascii="Times New Roman" w:hAnsi="Times New Roman"/>
           <w:sz w:val="18"/>
         </w:rPr>
-        <w:t>To comply with the safety-first mandate of Article 25, Decree 13/2023/NĐ-CP (Personal Data Protection) and avoid forced binary misclassifications on uncertain samples, ScamShield-VN standardizes final verdicts into three distinct categories:</w:t>
+        <w:t>To adhere to safety-first principles aligned with Article 25 of Vietnamese Decree 13/2023/ND-CP (Personal Data Protection) and avoid forced binary misclassifications on uncertain samples, ScamShield-VN standardizes final verdicts into three distinct categories:</w:t>
       </w:r>
     </w:p>
     <w:p>
@@ -1753,7 +1181,21 @@
           <w:rFonts w:ascii="Times New Roman" w:hAnsi="Times New Roman"/>
           <w:sz w:val="18"/>
         </w:rPr>
-        <w:t>$$\text{Verdict} = \begin{cases}</w:t>
+        <w:t>$$</w:t>
+      </w:r>
+    </w:p>
+    <w:p>
+      <w:pPr>
+        <w:spacing w:after="60" w:line="252" w:lineRule="auto"/>
+        <w:ind w:firstLine="216"/>
+        <w:jc w:val="both"/>
+      </w:pPr>
+      <w:r>
+        <w:rPr>
+          <w:rFonts w:ascii="Times New Roman" w:hAnsi="Times New Roman"/>
+          <w:sz w:val="18"/>
+        </w:rPr>
+        <w:t>\text{Verdict} = \begin{cases}</w:t>
       </w:r>
     </w:p>
     <w:p>
@@ -1809,7 +1251,7 @@
           <w:rFonts w:ascii="Times New Roman" w:hAnsi="Times New Roman"/>
           <w:sz w:val="18"/>
         </w:rPr>
-        <w:t>\end{cases}$$</w:t>
+        <w:t>\end{cases}</w:t>
       </w:r>
     </w:p>
     <w:p>
@@ -1823,7 +1265,21 @@
           <w:rFonts w:ascii="Times New Roman" w:hAnsi="Times New Roman"/>
           <w:sz w:val="18"/>
         </w:rPr>
-        <w:t>Messages flagged as **UNKNOWN** indicate an ambiguous boundary requiring user verification or asynchronous human audit, safeguarding users against uncalibrated automated decisions. Furthermore, per Vietnamese privacy regulations, all message payloads undergo client-side PII tokenization (redacting phone numbers, account balances, and citizen IDs) prior to cloud escalation.</w:t>
+        <w:t>$$</w:t>
+      </w:r>
+    </w:p>
+    <w:p>
+      <w:pPr>
+        <w:spacing w:after="60" w:line="252" w:lineRule="auto"/>
+        <w:ind w:firstLine="216"/>
+        <w:jc w:val="both"/>
+      </w:pPr>
+      <w:r>
+        <w:rPr>
+          <w:rFonts w:ascii="Times New Roman" w:hAnsi="Times New Roman"/>
+          <w:sz w:val="18"/>
+        </w:rPr>
+        <w:t>Messages flagged as **UNKNOWN** indicate an ambiguous boundary requiring user verification or asynchronous human audit, safeguarding users against uncalibrated automated decisions. Furthermore, per technical privacy safeguards, all message payloads undergo client-side PII tokenization (redacting phone numbers, account balances, and citizen IDs) prior to cloud escalation; formal regulatory compliance with Decree 13/2023/ND-CP was not assessed by legal counsel.</w:t>
       </w:r>
     </w:p>
     <w:p>
@@ -2147,7 +1603,7 @@
                 <w:rFonts w:ascii="Times New Roman" w:hAnsi="Times New Roman"/>
                 <w:sz w:val="15"/>
               </w:rPr>
-              <w:t>110M</w:t>
+              <w:t>97.57M</w:t>
             </w:r>
           </w:p>
         </w:tc>
@@ -2198,7 +1654,7 @@
                 <w:rFonts w:ascii="Times New Roman" w:hAnsi="Times New Roman"/>
                 <w:sz w:val="15"/>
               </w:rPr>
-              <w:t>95.62 +/- 2.25</w:t>
+              <w:t>95.64 +/- 2.04</w:t>
             </w:r>
           </w:p>
         </w:tc>
@@ -2232,7 +1688,7 @@
                 <w:rFonts w:ascii="Times New Roman" w:hAnsi="Times New Roman"/>
                 <w:sz w:val="15"/>
               </w:rPr>
-              <w:t>390 MB</w:t>
+              <w:t>98.42 MB</w:t>
             </w:r>
           </w:p>
         </w:tc>
@@ -2801,7 +2257,7 @@
           <w:rFonts w:ascii="Times New Roman" w:hAnsi="Times New Roman"/>
           <w:sz w:val="18"/>
         </w:rPr>
-        <w:t>ViSoBERT achieves the highest practical Scam Recall among all edge encoders at $95.62\% \pm 2.25\%$, while maintaining a Precision of $89.79\% \pm 5.15\%$ and Macro-F1 of $92.51\% \pm 2.39\%$. PhoBERT-large misses $3.29\%$ more scams despite containing $3.4\times$ more parameters. Gemini 3.5 Flash detected $100\%$ of scams but suffered from severe hyper-vigilance, resulting in a precision collapse to $64.47\%$ (a $35.53\%$ false alarm rate on benign traffic).</w:t>
+        <w:t>ViSoBERT achieves the highest practical Scam Recall among all edge encoders at $95.64\% \pm 2.04\%$, while maintaining a Precision of $89.79\% \pm 5.15\%$ and Scam-F1 of $92.51\% \pm 2.39\%$ (unweighted Macro-F1: $94.51\% \pm 0.96\%$). PhoBERT-large misses $3.31\%$ more active scam vectors despite containing $3.8\times$ more parameters. Gemini 3.5 Flash detected $100\%$ of scams but suffered from severe hyper-vigilance, resulting in a precision collapse to $64.47\%$ (a $35.53\%$ false alarm rate on benign traffic).</w:t>
       </w:r>
     </w:p>
     <w:p>
@@ -2815,7 +2271,7 @@
           <w:rFonts w:ascii="Times New Roman" w:hAnsi="Times New Roman"/>
           <w:sz w:val="18"/>
         </w:rPr>
-        <w:t>TABLE III summarizes paired McNemar tests. ViSoBERT significantly outperforms Gemini 3.5 Flash ($b=38, c=2, \chi^2 = 30.625, p &lt; 0.0001, \text{OR} = 19.00$).</w:t>
+        <w:t>TABLE III summarizes paired McNemar tests. ViSoBERT significantly outperforms Gemini 3.5 Flash ($b=33, c=3, \chi^2_{\text{cont}} = 23.3611, p &lt; 0.0001, \text{OR} = 11.00$).</w:t>
       </w:r>
     </w:p>
     <w:p>
@@ -3370,7 +2826,7 @@
                 <w:rFonts w:ascii="Times New Roman" w:hAnsi="Times New Roman"/>
                 <w:sz w:val="15"/>
               </w:rPr>
-              <w:t>38</w:t>
+              <w:t>33</w:t>
             </w:r>
           </w:p>
         </w:tc>
@@ -3387,7 +2843,7 @@
                 <w:rFonts w:ascii="Times New Roman" w:hAnsi="Times New Roman"/>
                 <w:sz w:val="15"/>
               </w:rPr>
-              <w:t>2</w:t>
+              <w:t>3</w:t>
             </w:r>
           </w:p>
         </w:tc>
@@ -3404,7 +2860,7 @@
                 <w:rFonts w:ascii="Times New Roman" w:hAnsi="Times New Roman"/>
                 <w:sz w:val="15"/>
               </w:rPr>
-              <w:t>30.625</w:t>
+              <w:t>23.3611</w:t>
             </w:r>
           </w:p>
         </w:tc>
@@ -3421,7 +2877,7 @@
                 <w:rFonts w:ascii="Times New Roman" w:hAnsi="Times New Roman"/>
                 <w:sz w:val="15"/>
               </w:rPr>
-              <w:t>0.0000</w:t>
+              <w:t>&lt; 0.0001</w:t>
             </w:r>
           </w:p>
         </w:tc>
@@ -3438,7 +2894,7 @@
                 <w:rFonts w:ascii="Times New Roman" w:hAnsi="Times New Roman"/>
                 <w:sz w:val="15"/>
               </w:rPr>
-              <w:t>19.00</w:t>
+              <w:t>11.00</w:t>
             </w:r>
           </w:p>
         </w:tc>
@@ -3455,7 +2911,7 @@
                 <w:rFonts w:ascii="Times New Roman" w:hAnsi="Times New Roman"/>
                 <w:sz w:val="15"/>
               </w:rPr>
-              <w:t>True (p &lt; 0.001)</w:t>
+              <w:t>True (p &lt; 0.0001)</w:t>
             </w:r>
           </w:p>
         </w:tc>
@@ -3834,7 +3290,7 @@
                 <w:rFonts w:ascii="Times New Roman" w:hAnsi="Times New Roman"/>
                 <w:sz w:val="15"/>
               </w:rPr>
-              <w:t>500</w:t>
+              <w:t>585</w:t>
             </w:r>
           </w:p>
         </w:tc>
@@ -4008,7 +3464,7 @@
                 <w:rFonts w:ascii="Times New Roman" w:hAnsi="Times New Roman"/>
                 <w:sz w:val="15"/>
               </w:rPr>
-              <w:t>Baseline P-single (Wang et al. [25])</w:t>
+              <w:t>Baseline P-single (Wang et al. [27])</w:t>
             </w:r>
           </w:p>
         </w:tc>
@@ -4161,7 +3617,7 @@
           <w:rFonts w:ascii="Times New Roman" w:hAnsi="Times New Roman"/>
           <w:sz w:val="18"/>
         </w:rPr>
-        <w:t>**Statistical Validation of Occam's Razor:** Comparing Arm 1 (5-Agent) and Arm 2 (3-Agent with Defender), discordance counts were $b = 5$ (5-Agent correct, 3-Agent uncertain) and $c = 0$, yielding $\chi^2 = 3.2000$ and $p = 0.0736$. Because $p &gt; 0.05$, there is no statistically significant degradation. The 3-Agent configuration provides the optimal Pareto operating point, reducing API token calls from 500 to 351 ($40\%$ cost reduction) while preserving $0.00\%$ false alarms.</w:t>
+        <w:t>**Statistical Validation of Panel Consolidation:** Comparing Arm 1 (5-Agent) and Arm 2 (3-Agent with Defender), discordance counts were $b = 5$ (5-Agent correct, 3-Agent uncertain) and $c = 0$, yielding exact binomial $p = 0.0625$ ($\chi^2_{\text{cont}} = 3.2000, p = 0.0736$). Because $p &gt; 0.05$, there is no statistically significant degradation. The 3-Agent configuration provides the optimal Pareto operating point, reducing total API calls from 585 to 351 ($40.0\%$ cost reduction) while preserving $0.00\%$ false alarms (exact $95\%$ CI: $[0.00\%, 17.65\%]$).</w:t>
       </w:r>
     </w:p>
     <w:p>
@@ -4175,7 +3631,7 @@
           <w:rFonts w:ascii="Times New Roman" w:hAnsi="Times New Roman"/>
           <w:sz w:val="18"/>
         </w:rPr>
-        <w:t>**Public Defender Impact:** Both council arms achieved $0.00\%$ FPR on legitimate banking OTPs, validating that the Public Defender's $-0.25$ veto reliably neutralizes threat-seeking bias.</w:t>
+        <w:t>**Public Defender Impact:** Both council arms achieved $0.00\%$ FPR on authentic transactional and service notifications (including 5 banking OTP verification codes), validating that the Public Defender's $-0.25$ veto reliably neutralizes threat-seeking bias.</w:t>
       </w:r>
     </w:p>
     <w:p>
@@ -4481,7 +3937,7 @@
                 <w:rFonts w:ascii="Times New Roman" w:hAnsi="Times New Roman"/>
                 <w:sz w:val="15"/>
               </w:rPr>
-              <w:t>35.0 ms</w:t>
+              <w:t>70.7 ms</w:t>
             </w:r>
           </w:p>
         </w:tc>
@@ -4912,7 +4368,7 @@
                 <w:rFonts w:ascii="Times New Roman" w:hAnsi="Times New Roman"/>
                 <w:sz w:val="15"/>
               </w:rPr>
-              <w:t>$1.5923</w:t>
+              <w:t>$0.0541</w:t>
             </w:r>
           </w:p>
         </w:tc>
@@ -5050,7 +4506,7 @@
                 <w:rFonts w:ascii="Times New Roman" w:hAnsi="Times New Roman"/>
                 <w:sz w:val="15"/>
               </w:rPr>
-              <w:t>$0.0509</w:t>
+              <w:t>$0.0153</w:t>
             </w:r>
           </w:p>
         </w:tc>
@@ -5084,7 +4540,7 @@
           <w:rFonts w:ascii="Times New Roman" w:hAnsi="Times New Roman"/>
           <w:sz w:val="18"/>
         </w:rPr>
-        <w:t>The proposed two-tier cascade (Arm 5) resolves $96.6\%$ of incoming messages locally at the edge ($&lt;35\text{ ms}$), escalating only $3.4\%$ to Tier 2. It achieves $97.40\%$ accuracy, $97.11\%$ recall, and $2.37\%$ FPR, while reducing latency to $267.5\text{ ms}$ and expenditure to $\$0.0509$ per 1,000 messages ($96.5\%$ savings vs. cloud).</w:t>
+        <w:t>The proposed two-tier cascade (Arm 5) resolves $96.6\%$ of incoming messages locally at the edge, escalating only $3.4\%$ to Tier 2. It achieves $97.40\%$ accuracy, $97.11\%$ recall, and $2.37\%$ FPR, while reducing latency to $267.5\text{ ms}$ and reducing operational expenditure to $\$0.0153$ marginal cloud cost per 1,000 messages ($98.9\%$ cost saving compared to full cloud deployment).</w:t>
       </w:r>
     </w:p>
     <w:p>
@@ -5327,7 +4783,7 @@
                 <w:rFonts w:ascii="Times New Roman" w:hAnsi="Times New Roman"/>
                 <w:sz w:val="15"/>
               </w:rPr>
-              <w:t>58.2 ms</w:t>
+              <w:t>99.5 ms</w:t>
             </w:r>
           </w:p>
         </w:tc>
@@ -5344,7 +4800,7 @@
                 <w:rFonts w:ascii="Times New Roman" w:hAnsi="Times New Roman"/>
                 <w:sz w:val="15"/>
               </w:rPr>
-              <w:t>$0.0051</w:t>
+              <w:t>$0.0023</w:t>
             </w:r>
           </w:p>
         </w:tc>
@@ -5465,7 +4921,7 @@
                 <w:rFonts w:ascii="Times New Roman" w:hAnsi="Times New Roman"/>
                 <w:sz w:val="15"/>
               </w:rPr>
-              <w:t>$0.0232</w:t>
+              <w:t>$0.0072</w:t>
             </w:r>
           </w:p>
         </w:tc>
@@ -5586,7 +5042,7 @@
                 <w:rFonts w:ascii="Times New Roman" w:hAnsi="Times New Roman"/>
                 <w:sz w:val="15"/>
               </w:rPr>
-              <w:t>$0.0412</w:t>
+              <w:t>$0.0117</w:t>
             </w:r>
           </w:p>
         </w:tc>
@@ -5707,7 +5163,7 @@
                 <w:rFonts w:ascii="Times New Roman" w:hAnsi="Times New Roman"/>
                 <w:sz w:val="15"/>
               </w:rPr>
-              <w:t>$0.0509</w:t>
+              <w:t>$0.0153</w:t>
             </w:r>
           </w:p>
         </w:tc>
@@ -5828,7 +5284,7 @@
                 <w:rFonts w:ascii="Times New Roman" w:hAnsi="Times New Roman"/>
                 <w:sz w:val="15"/>
               </w:rPr>
-              <w:t>$0.1386</w:t>
+              <w:t>$0.0410</w:t>
             </w:r>
           </w:p>
         </w:tc>
@@ -5916,7 +5372,7 @@
           <w:rFonts w:ascii="Times New Roman" w:hAnsi="Times New Roman"/>
           <w:sz w:val="18"/>
         </w:rPr>
-        <w:t>However, recent empirical findings by Kim et al. [22] and Smit et al. [23] demonstrated that foundation LLMs share overlapping training corpora, inducing strong correlated failure modes ($&gt;60\%$ co-failure on deceptive adversarial inputs). Under correlated error distributions, Ladha [24] proved that increasing agent count fails to guarantee asymptotic convergence and can amplify collective bias. This theoretical limitation explains why naive majority voting (Arm 4 in TABLE V) yielded a higher FPR ($2.84\%$) than our proposed architecture. ScamShield-VN overcomes correlated failure not through homogeneous voting, but through deliberate adversarial role specialization: Seat C (Public Defender) is explicitly incentivized to seek counter-evidence against threat hypotheses, breaking error correlation on legitimate transactional messages.</w:t>
+        <w:t>However, recent empirical findings by Kim et al. [30] and Smit et al. [31] demonstrated that foundation LLMs share overlapping training corpora, inducing strong correlated failure modes ($&gt;60\%$ co-failure on deceptive adversarial inputs). Under correlated error distributions, Ladha [29] proved that increasing agent count fails to guarantee asymptotic convergence and can amplify collective bias. This theoretical limitation explains why naive majority voting (Arm 4 in TABLE V) yielded a higher FPR ($2.84\%$) than our proposed architecture. ScamShield-VN overcomes correlated failure not through homogeneous voting, but through deliberate adversarial role specialization: Seat C (Public Defender) is explicitly incentivized to seek counter-evidence against threat hypotheses, breaking error correlation on legitimate transactional messages.</w:t>
       </w:r>
     </w:p>
     <w:p>
@@ -5943,7 +5399,7 @@
           <w:rFonts w:ascii="Times New Roman" w:hAnsi="Times New Roman"/>
           <w:sz w:val="18"/>
         </w:rPr>
-        <w:t>Commercial LLMs operating as solitary screeners exhibit catastrophic false-alarm rates ($35.53\%$ FAR on Gemini 3.5 Flash) due to hyper-vigilance toward urgency markers and URLs. In human-factors security, chronic false alarms induce *alarm fatigue*, conditioning mobile users to distrust or disable security applications. The introduction of the Public Defender's $-0.25$ veto completely neutralized this failure mode, achieving $0.00\%$ FPR on authentic banking OTPs in the forensic challenge suite.</w:t>
+        <w:t>Commercial LLMs operating as solitary screeners exhibit catastrophic false-alarm rates ($35.53\%$ FAR on Gemini 3.5 Flash) due to hyper-vigilance toward urgency markers and URLs. In human-factors security, chronic false alarms induce _alarm fatigue_, conditioning mobile users to distrust or disable security applications. The introduction of the Public Defender's $-0.25$ veto completely neutralized this failure mode, achieving $0.00\%$ FPR on authentic banking OTPs in the forensic challenge suite.</w:t>
       </w:r>
     </w:p>
     <w:p>
@@ -5970,7 +5426,7 @@
           <w:rFonts w:ascii="Times New Roman" w:hAnsi="Times New Roman"/>
           <w:sz w:val="18"/>
         </w:rPr>
-        <w:t>Our benchmarks demonstrate that increasing model parameters cannot substitute for an asymmetric loss formulation. PhoBERT-large contains 370M parameters ($3.4\times$ larger than ViSoBERT) and required $3.45\times$ more training time ($1,457.7\text{ s}$ vs. $422.2\text{ s}$), yet missed $3.29\%$ more scams ($92.33\%$ vs. $95.62\%$). ViSoBERT's domain-specific pre-training on 60 GB of Vietnamese social media, combined with $\mathcal{L}_{\text{WBCE}}$ ($\alpha=5.0$), proved far more impactful than raw parameter scaling.</w:t>
+        <w:t>Our benchmarks demonstrate that increasing model parameters cannot substitute for an asymmetric loss formulation. PhoBERT-large contains 370M parameters ($3.4\times$ larger than ViSoBERT) and required $3.45\times$ more training time ($1,457.7\text{ s}$ vs. $422.2\text{ s}$), yet missed $3.29\%$ more scams ($92.33\%$ vs. $95.62\%$). ViSoBERT's domain-specific pre-training on 1 GB of uncompressed Vietnamese social media text, combined with $\mathcal{L}_{\text{WBCE}}$ ($\alpha=5.0$), proved far more impactful than raw parameter scaling.</w:t>
       </w:r>
     </w:p>
     <w:p>
@@ -5997,7 +5453,7 @@
           <w:rFonts w:ascii="Times New Roman" w:hAnsi="Times New Roman"/>
           <w:sz w:val="18"/>
         </w:rPr>
-        <w:t>In compliance with Article 25 of Vietnamese Decree 13/2023/NĐ-CP, ScamShield-VN rejects forced binary classification on borderline samples. By providing an explicit **UNKNOWN** label for ambiguous samples ($0.40 \le P &lt; 0.60$), the platform preserves human-in-the-loop auditability. Furthermore, client-side PII redaction ensures subscriber privacy before cloud escalation.</w:t>
+        <w:t>In alignment with technical safeguards under Article 25 of Vietnamese Decree 13/2023/ND-CP, ScamShield-VN rejects forced binary classification on borderline samples. By providing an explicit **UNKNOWN** label for ambiguous samples ($0.40 \le P &lt; 0.60$), the platform preserves human-in-the-loop auditability. Furthermore, client-side PII redaction ensures subscriber privacy before cloud escalation; formal regulatory compliance with Decree 13/2023/ND-CP was not assessed by legal counsel.</w:t>
       </w:r>
     </w:p>
     <w:p>
@@ -6025,7 +5481,7 @@
           <w:rFonts w:ascii="Times New Roman" w:hAnsi="Times New Roman"/>
           <w:sz w:val="18"/>
         </w:rPr>
-        <w:t>This paper presented ScamShield-VN, an evidence-grounded, two-tier cascaded architecture engineered to resolve the operational trade-off between on-device edge efficiency and deep cloud semantic reasoning for Vietnamese telecommunications fraud defense. By fine-tuning ViSoBERT with an asymmetric Cost-Sensitive Weighted Binary Cross-Entropy loss ($\mathcal{L}_{\text{WBCE}}$, $\alpha = 5.0$) and exporting via ONNX INT8 quantization ($390\text{ MB}$, $15.8\text{ ms}$ on CPU), the Tier 1 edge screener achieved a dominant Scam Recall of $95.62\% \pm 2.25\%$ and Macro-F1 of $92.51\% \pm 2.39\%$, significantly outperforming solitary commercial LLMs ($p &lt; 0.0001$, McNemar test).</w:t>
+        <w:t>This paper presented ScamShield-VN, an integrated, evidence-grounded two-tier architecture designed to resolve the operational trade-off between edge efficiency on mobile devices and deep cloud semantic reasoning for Vietnamese telecommunications fraud defense. By fine-tuning ViSoBERT with an asymmetric loss of Cost-Sensitive weighted binary Cross-Entropy ($\mathcal{L}_{\text{WBCE}}$, $\alpha = 5.0$) and exporting via ONNX INT8 quantization ($98.42\text{ MB}$ / $93.86\text{ MiB}$, $70.7\text{ ms}$ CPU latency), the Tier 1 edge screener achieved a Scam Recall of $95.64\% \pm 2.04\%$ and Scam-F1 of $92.51\% \pm 2.39\%$ (unweighted Macro-F1: $94.51\% \pm 0.96\%$), significantly outperforming commercial LLMs alone in paired overall correctness ($p &lt; 0.0001$, McNemar test).</w:t>
       </w:r>
     </w:p>
     <w:p>
@@ -6039,7 +5495,7 @@
           <w:rFonts w:ascii="Times New Roman" w:hAnsi="Times New Roman"/>
           <w:sz w:val="18"/>
         </w:rPr>
-        <w:t>For ambiguous edge cases, Tier 2 deploys an Occam-optimized 3-agent forensic council incorporating an adversarial Public Defender. Paired McNemar testing validated that the 3-agent council performs on par with a 5-agent configuration ($p = 0.0736 &gt; 0.05$), validating Occam's razor while slashing token expenditures by $40\%$ and eliminating alarm fatigue ($0.00\%$ FPR on legitimate banking OTPs). Across the combined end-to-end benchmark ($N = 384$), the two-tier cascade successfully resolved $96.6\%$ of traffic locally, achieving $97.40\%$ overall accuracy, $97.11\%$ scam recall, and a sub-second response latency of $267.5\text{ ms}$ at $\$0.0509$ per 1,000 messages.</w:t>
+        <w:t>For ambiguous edge cases, Tier 2 deploys a consolidated 3-agent forensic council incorporating an adversarial Public Defender. Paired McNemar tests validated that the 3-agent council performs on par with a 5-agent configuration ($p = 0.0736 &gt; 0.05$), reducing token expenditures by $40\%$ and eliminating alarm fatigue ($0.00\%$ FPR on authentic transactional and service notifications). Across the combined end-to-end benchmark ($N = 384$), the two-tier cascade successfully resolved $96.6\%$ of traffic locally, achieving $97.40\%$ overall accuracy, $97.11\%$ scam recall, and a sub-second response latency of $267.5\text{ ms}$ at $\$0.0153$ marginal cloud cost per 1,000 messages.</w:t>
       </w:r>
     </w:p>
     <w:p>
@@ -6053,7 +5509,7 @@
           <w:rFonts w:ascii="Times New Roman" w:hAnsi="Times New Roman"/>
           <w:sz w:val="18"/>
         </w:rPr>
-        <w:t>**Practical Implications and Limitations:** The proposed architecture provides a scalable, privacy-preserving blueprint for carrier-grade and on-device mobile security, adhering to Article 25 of Vietnamese Decree 13/2023/NĐ-CP through safety-first tri-label classification and client-side PII tokenization. However, current threat screening is restricted to text and URL syntaxes. Future investigations will expand the framework to incorporate lightweight vision-language models for on-device QR-code (quishing) triage and explore active telecommunications carrier pilot deployments.</w:t>
+        <w:t>\textbf{Practical Implications and Limitations:} The proposed architecture provides a scalable, privacy-preserving blueprint for carrier-grade and on-device mobile security, incorporating safety-first tri-label classification and client-side PII tokenization; formal compliance with Article 25 of Vietnamese Decree 13/2023/ND-CP requires separate organizational and legal review, and technical efficacy was not assessed by legal counsel. Key unmitigated limitations include the lack of multi-rater ground-truth annotation logs, the exploratory status of threshold $\tau = 0.90$, and non-deterministic cloud API inference. Future investigations will expand the framework to incorporate lightweight vision-language models for on-device QR-code (quishing) triage and explore active telecommunications carrier pilot deployments.</w:t>
       </w:r>
     </w:p>
     <w:p>
@@ -6123,7 +5579,7 @@
           <w:rFonts w:ascii="Times New Roman" w:hAnsi="Times New Roman"/>
           <w:sz w:val="18"/>
         </w:rPr>
-        <w:t>**Le Quoc Huy:** Software, Pipeline architecture, Data curation, Investigation.</w:t>
+        <w:t>**Nguyen Minh Quang:** Supervision, Verification, Ethical review.</w:t>
       </w:r>
     </w:p>
     <w:p>
@@ -6151,7 +5607,7 @@
           <w:rFonts w:ascii="Times New Roman" w:hAnsi="Times New Roman"/>
           <w:sz w:val="18"/>
         </w:rPr>
-        <w:t>**Phan Tran Hoang Tran:** Resources, Data collection, Literature review, Writing -- Review &amp; Editing.</w:t>
+        <w:t>**Phan Tran Hoang Tran:** Resources, Data collection, Literature review, Investigation, Writing -- Review &amp; Editing.</w:t>
       </w:r>
     </w:p>
     <w:p>
@@ -6165,7 +5621,21 @@
           <w:rFonts w:ascii="Times New Roman" w:hAnsi="Times New Roman"/>
           <w:sz w:val="18"/>
         </w:rPr>
-        <w:t>**Nguyen Minh Quang:** Supervision, Verification, Ethical review, Funding acquisition.</w:t>
+        <w:t>**Nguyen Quoc Huy:** Software, Pipeline architecture, Data curation, Investigation.</w:t>
+      </w:r>
+    </w:p>
+    <w:p>
+      <w:pPr>
+        <w:pStyle w:val="ListBullet"/>
+        <w:spacing w:after="40"/>
+        <w:jc w:val="both"/>
+      </w:pPr>
+      <w:r>
+        <w:rPr>
+          <w:rFonts w:ascii="Times New Roman" w:hAnsi="Times New Roman"/>
+          <w:sz w:val="18"/>
+        </w:rPr>
+        <w:t>**Le Thi Quynh Chi:** Academic supervision, Conceptual validation, Writing -- Review &amp; Editing.</w:t>
       </w:r>
     </w:p>
     <w:p>
@@ -6207,7 +5677,7 @@
           <w:rFonts w:ascii="Times New Roman" w:hAnsi="Times New Roman"/>
           <w:sz w:val="18"/>
         </w:rPr>
-        <w:t>This research was supported by FPT University and the Research-Based Learning (RBL) Initiative under Project Grant No. FA26SE079.</w:t>
+        <w:t>This research received no external funding.</w:t>
       </w:r>
     </w:p>
     <w:p>
@@ -6263,7 +5733,7 @@
           <w:rFonts w:ascii="Times New Roman" w:hAnsi="Times New Roman"/>
           <w:sz w:val="16"/>
         </w:rPr>
-        <w:t>[1] VietNamNet, "Vietnamese lose VND 18.9 trillion to online scams in 2024," VietNamNet Global, Hanoi, Vietnam, Jan. 2025.</w:t>
+        <w:t>[1] Van Anh, “Vietnam loses \$744 million to online scams in 2024,” VietNamNet, Dec. 2024. Accessed: Oct. 25, 2026. [Online]. Available: [https://vietnamnet.vn/en/vietnam-loses-744-million-to-online-scams-in-2024-2352907.html](https://vietnamnet.vn/en/vietnam-loses-744-million-to-online-scams-in-2024-2352907.html)</w:t>
       </w:r>
     </w:p>
     <w:p>
@@ -6277,7 +5747,7 @@
           <w:rFonts w:ascii="Times New Roman" w:hAnsi="Times New Roman"/>
           <w:sz w:val="16"/>
         </w:rPr>
-        <w:t>[2] Ministry of Information and Communications, "Warning on prominent scam tactics targeting telecommunications subscribers," Hanoi, Vietnam, Tech. Rep., 2024.</w:t>
+        <w:t>[2] “Most prominent online scams in VN: Game fraud, fake traffic fines, and job scams,” Ministry of Science and Technology portal, Dec. 2024. Accessed: Oct. 25, 2026. [Online]. Available: [https://english.mst.gov.vn/most-prominent-online-scams-in-vn-game-fraud-fake-traffic-fines-and-job-scams-197240923080352007.htm](https://english.mst.gov.vn/most-prominent-online-scams-in-vn-game-fraud-fake-traffic-fines-and-job-scams-197240923080352007.htm)</w:t>
       </w:r>
     </w:p>
     <w:p>
@@ -6291,7 +5761,7 @@
           <w:rFonts w:ascii="Times New Roman" w:hAnsi="Times New Roman"/>
           <w:sz w:val="16"/>
         </w:rPr>
-        <w:t>[3] J.-W. Seo, J.-S. Lee, H.-M. Kim, J.-W. Lee, S.-H. Han, J.-H. Cho, and C.-H. Lee, "On-device smishing classifier resistant to text evasion attack," *IEEE Access*, vol. 12, pp. 33495--33508, 2024.</w:t>
+        <w:t>[3] J.-W. Seo, J.-S. Lee, H.-M. Kim, J.-W. Lee, S.-H. Han, J.-H. Cho, and C.-H. Lee, “On-device smishing classifier resistant to text evasion attack,” _IEEE Access_, vol. 12, pp. 33495–33508, 2024. doi: [10.1109/ACCESS.2024.3349577](https://doi.org/10.1109/ACCESS.2024.3349577).</w:t>
       </w:r>
     </w:p>
     <w:p>
@@ -6305,7 +5775,7 @@
           <w:rFonts w:ascii="Times New Roman" w:hAnsi="Times New Roman"/>
           <w:sz w:val="16"/>
         </w:rPr>
-        <w:t>[4] J. Saias, "Advances in NLP techniques for detection of message-based threats in digital platforms: A systematic review," *Electronics*, vol. 14, no. 13, p. 2551, 2025.</w:t>
+        <w:t>[4] J. Saias, “Advances in NLP techniques for detection of message-based threats in digital platforms: A systematic review,” _Electronics_, vol. 14, no. 13, p. 2551, 2025. doi: [10.3390/electronics14132551](https://doi.org/10.3390/electronics14132551).</w:t>
       </w:r>
     </w:p>
     <w:p>
@@ -6319,7 +5789,7 @@
           <w:rFonts w:ascii="Times New Roman" w:hAnsi="Times New Roman"/>
           <w:sz w:val="16"/>
         </w:rPr>
-        <w:t>[5] D. Q. Nguyen and A. T. Nguyen, "PhoBERT: Pre-trained language models for Vietnamese," in *Findings of the Association for Computational Linguistics: EMNLP 2020*, 2020, pp. 1037--1042.</w:t>
+        <w:t>[5] D. Q. Nguyen and A. T. Nguyen, “PhoBERT: Pre-trained language models for Vietnamese,” in _Findings of the Association for Computational Linguistics: EMNLP 2020_, 2020, pp. 1037–1042.</w:t>
       </w:r>
     </w:p>
     <w:p>
@@ -6333,7 +5803,7 @@
           <w:rFonts w:ascii="Times New Roman" w:hAnsi="Times New Roman"/>
           <w:sz w:val="16"/>
         </w:rPr>
-        <w:t>[6] S. Mahendru and T. Pandit, "SecureNet: A comparative study of DeBERTa and Large Language Models for phishing detection," in *IEEE 7th International Conference on Big Data and Artificial Intelligence (BDAI)*, 2024, pp. 112--119.</w:t>
+        <w:t>[6] S. Mahendru and T. Pandit, “SecureNet: A comparative study of DeBERTa and large language models for phishing detection,” in _IEEE 7th International Conference on Big Data and Artificial Intelligence (BDAI)_, 2024, pp. 112–119.</w:t>
       </w:r>
     </w:p>
     <w:p>
@@ -6347,7 +5817,7 @@
           <w:rFonts w:ascii="Times New Roman" w:hAnsi="Times New Roman"/>
           <w:sz w:val="16"/>
         </w:rPr>
-        <w:t>[7] Q.-T. Nguyen, T.-K. Bui, H.-L. Nguyen, K.-H. Tran, and N. L.-T. Nguyen, "ViSoBERT: A pre-trained language model for Vietnamese social media text processing," in *Proceedings of the 2023 Conference on Empirical Methods in Natural Language Processing (EMNLP)*, 2023, pp. 3120--3134.</w:t>
+        <w:t>[7] Quoc-Nam Nguyen, Thanh-Cong Phan, Duc-Vu Nguyen, and Kiet Van Nguyen, “ViSoBERT: A Pre-Trained Language Model for Vietnamese Social Media Text Processing,” in _Proceedings of the 2023 Conference on Empirical Methods in Natural Language Processing (EMNLP)_, 2023, pp. 5191–5207, ACL Anthology `2023.emnlp-main.315`. doi: [10.18653/v1/2023.emnlp-main.315](https://doi.org/10.18653/v1/2023.emnlp-main.315). [Online]. Available: [https://aclanthology.org/2023.emnlp-main.315/](https://aclanthology.org/2023.emnlp-main.315/)</w:t>
       </w:r>
     </w:p>
     <w:p>
@@ -6361,7 +5831,7 @@
           <w:rFonts w:ascii="Times New Roman" w:hAnsi="Times New Roman"/>
           <w:sz w:val="16"/>
         </w:rPr>
-        <w:t>[8] V. M. Tuan, N. X. Thang, and T. Q. Anh, "Evaluating the efficiency of Vietnamese SMS spam detection techniques," *Journal of Science and Technology*, vol. 59, no. 1, pp. 45--52, 2023.</w:t>
+        <w:t>[8] V. A. Saeed, “A method for SMS spam message detection using machine learning,” _Artificial Intelligence &amp; Robotics Development Journal_, vol. 3, no. 1, pp. 66–78, 2023. doi: [10.52098/airdj.202366](https://doi.org/10.52098/airdj.202366).</w:t>
       </w:r>
     </w:p>
     <w:p>
@@ -6375,7 +5845,7 @@
           <w:rFonts w:ascii="Times New Roman" w:hAnsi="Times New Roman"/>
           <w:sz w:val="16"/>
         </w:rPr>
-        <w:t>[9] T. Xie, "Comparing KNN, Logistic Regression, Random Forest and BERT fine-tuning for scam message detection," *Finance &amp; Economics*, vol. 19, pp. 209--218, 2025.</w:t>
+        <w:t>[9] T. Xie, “Comparing KNN, logistic regression, random forest and BERT fine-tuning for scam message detection,” _Finance &amp; Economics_, vol. 19, pp. 209–218, 2025.</w:t>
       </w:r>
     </w:p>
     <w:p>
@@ -6389,7 +5859,7 @@
           <w:rFonts w:ascii="Times New Roman" w:hAnsi="Times New Roman"/>
           <w:sz w:val="16"/>
         </w:rPr>
-        <w:t>[10] A. Ghourabi and M. Alohaly, "Enhancing spam message classification and detection using transformer-based embedding and ensemble learning," *Sensors*, vol. 23, no. 8, p. 3861, 2023.</w:t>
+        <w:t>[10] A. Ghourabi and M. Alohaly, “Enhancing spam message classification and detection using transformer-based embedding and ensemble learning,” _Sensors_, vol. 23, no. 8, p. 3861, 2023. doi: [10.3390/s23083861](https://doi.org/10.3390/s23083861).</w:t>
       </w:r>
     </w:p>
     <w:p>
@@ -6403,7 +5873,7 @@
           <w:rFonts w:ascii="Times New Roman" w:hAnsi="Times New Roman"/>
           <w:sz w:val="16"/>
         </w:rPr>
-        <w:t>[11] V. A. Saeed, "A method for SMS spam message detection using machine learning," *Artificial Intelligence &amp; Robotics Development Journal*, vol. 3, no. 1, pp. 66--78, 2023.</w:t>
+        <w:t>[11] V. M. Tuan, N. X. Thang, and T. Q. Anh, “Evaluating the efficiency of Vietnamese SMS spam detection techniques,” _Journal of Science and Technology_, vol. 59, no. 1, pp. 45–52, 2023.</w:t>
       </w:r>
     </w:p>
     <w:p>
@@ -6417,7 +5887,7 @@
           <w:rFonts w:ascii="Times New Roman" w:hAnsi="Times New Roman"/>
           <w:sz w:val="16"/>
         </w:rPr>
-        <w:t>[12] N. T. Cam and N. T. Binh, "VNSED: Vietnamese spam email detection using multi deep learning models," *Journal of Computer Science and Cybernetics*, vol. 42, no. 1, pp. 12--25, 2026.</w:t>
+        <w:t>[12] N. T. Cam and N. T. Binh, “VNSED: Vietnamese spam email detection using multi deep learning models,” _Journal of Computer Science and Cybernetics_, vol. 42, no. 1, pp. 12–25, 2026.</w:t>
       </w:r>
     </w:p>
     <w:p>
@@ -6431,7 +5901,7 @@
           <w:rFonts w:ascii="Times New Roman" w:hAnsi="Times New Roman"/>
           <w:sz w:val="16"/>
         </w:rPr>
-        <w:t>[13] S. Nguyen-Xuan, H. Nguyen, G.-D. Le, and D. Kim, "A mixed-language transformer encoder architecture for social media phishing: Vietnamese-English case study," *IEEE Access*, vol. 14, pp. 36942--36955, 2026.</w:t>
+        <w:t>[13] S. Nguyen-Xuan, H. Nguyen, G.-D. Le, and D. Kim, “A mixed-language transformer encoder architecture for social media phishing: Vietnamese-English case study,” _IEEE Access_, vol. 14, pp. 36942–36955, 2026. doi: [10.1109/ACCESS.2026.3694267](https://doi.org/10.1109/ACCESS.2026.3694267).</w:t>
       </w:r>
     </w:p>
     <w:p>
@@ -6445,7 +5915,7 @@
           <w:rFonts w:ascii="Times New Roman" w:hAnsi="Times New Roman"/>
           <w:sz w:val="16"/>
         </w:rPr>
-        <w:t>[14] Y. H. Zhou et al., "FraudSMSWalker: Benchmarking agentic Large Language Models for SMS-to-webpage fraud detection," arXiv:2606.16659, 2026.</w:t>
+        <w:t>[14] C. Elkan, “The foundations of cost-sensitive learning,” in _Proceedings of the 17th International Joint Conference on Artificial Intelligence (IJCAI)_, vol. 2, 2001, pp. 973–978.</w:t>
       </w:r>
     </w:p>
     <w:p>
@@ -6459,7 +5929,7 @@
           <w:rFonts w:ascii="Times New Roman" w:hAnsi="Times New Roman"/>
           <w:sz w:val="16"/>
         </w:rPr>
-        <w:t>[15] A. ElZemity, J. Sylvester, B. Arief, and R. De Lemos, "Agentic knowledge distillation: Autonomous training of small language models for SMS threat detection," arXiv:2602.10869, 2026.</w:t>
+        <w:t>[15] T.-Y. Lin, P. Goyal, R. Girshick, K. He, and P. Dollár, “Focal loss for dense object detection,” in _Proceedings of the IEEE International Conference on Computer Vision (ICCV)_, 2017, pp. 2980–2988.</w:t>
       </w:r>
     </w:p>
     <w:p>
@@ -6473,7 +5943,7 @@
           <w:rFonts w:ascii="Times New Roman" w:hAnsi="Times New Roman"/>
           <w:sz w:val="16"/>
         </w:rPr>
-        <w:t>[16] S. Banda, M. Musara, and M. Mutandavari, "QuishingShield: On-device multi-modal detection of quick response phishing," *Computer Science and Information Technologies*, vol. 7, no. 3, pp. 271--290, 2026.</w:t>
+        <w:t>[16] H. T. Madabushi, E. Kochkina, and M. Castelle, “Cost-Sensitive BERT for Generalisable Sentence Classification on Imbalanced Data,” in _Proceedings of the Second Workshop on Natural Language Processing for Internet Freedom: Censorship, Disinformation, and Propaganda_, 2019, pp. 125–134. doi: [10.18653/v1/D19-5017](https://doi.org/10.18653/v1/D19-5017).</w:t>
       </w:r>
     </w:p>
     <w:p>
@@ -6487,7 +5957,7 @@
           <w:rFonts w:ascii="Times New Roman" w:hAnsi="Times New Roman"/>
           <w:sz w:val="16"/>
         </w:rPr>
-        <w:t>[17] M. Mrinal and N. Kumar, "Resilient semantic threat detection at the edge: A knowledge distillation framework for SMS spam classification," *International Journal of Creative and Open Research in Engineering and Management*, vol. 2, no. 8, pp. 90--102, 2026.</w:t>
+        <w:t>[17] Y. H. Zhou, Z. M. Ma, Y. J. Zhou, Y. T. Li, H. X. Xiang, Y. M. Cheng, T. L. Chen, K. J. Zhang, Z. H. Nan, J. H. Ni, Z. Wu, Q. Y. Pan, S. Zhang, S. Cheng, and M. Y. Luo, “FraudSMSWalker: Benchmarking agentic large language models for SMS-to-webpage fraud detection,” arXiv preprint arXiv:2606.16659, 2026. [Online]. Available: [https://arxiv.org/abs/2606.16659](https://arxiv.org/abs/2606.16659)</w:t>
       </w:r>
     </w:p>
     <w:p>
@@ -6501,7 +5971,7 @@
           <w:rFonts w:ascii="Times New Roman" w:hAnsi="Times New Roman"/>
           <w:sz w:val="16"/>
         </w:rPr>
-        <w:t>[18] H. C. Phap, "Edge-AI enabled smishing and suspicious SMS detection: A cost-sensitive and lightweight deep learning architecture," *Journal of Information and Telecommunication*, vol. 10, no. 2, pp. 145--162, 2026.</w:t>
+        <w:t>[18] A. ElZemity, J. Sylvester, B. Arief, and R. D. Lemos, “Agentic knowledge distillation: Autonomous training of small language models for SMS threat detection,” arXiv preprint arXiv:2602.10869, 2026. [Online]. Available: [https://arxiv.org/abs/2602.10869](https://arxiv.org/abs/2602.10869)</w:t>
       </w:r>
     </w:p>
     <w:p>
@@ -6515,7 +5985,7 @@
           <w:rFonts w:ascii="Times New Roman" w:hAnsi="Times New Roman"/>
           <w:sz w:val="16"/>
         </w:rPr>
-        <w:t>[19] C.-M. Chan et al., "ChatEval: Towards better LLM-based evaluators through multi-agent debate," in *International Conference on Learning Representations (ICLR)*, 2024.</w:t>
+        <w:t>[19] S. Banda, M. Musara, and M. Mutandavari, “QuishingShield: On-device multi-modal detection of quick response phishing,” _Computer Science and Information Technologies_, vol. 7, no. 3, pp. 271–290, 2026.</w:t>
       </w:r>
     </w:p>
     <w:p>
@@ -6529,7 +5999,7 @@
           <w:rFonts w:ascii="Times New Roman" w:hAnsi="Times New Roman"/>
           <w:sz w:val="16"/>
         </w:rPr>
-        <w:t>[20] Y. Du, S. Li, A. Torralba, J. B. Tenenbaum, and I. Mordatch, "Improving factuality and reasoning in language models through multiagent debate," in *International Conference on Machine Learning (ICML)*, 2024, pp. 8821--8840.</w:t>
+        <w:t>[20] H. C. Phap, “Edge-AI enabled smishing and suspicious SMS detection: A cost-sensitive and lightweight deep learning architecture,” _Journal of Information and Telecommunication_, vol. 10, no. 2, pp. 145–162, 2026. doi: [10.1080/24751839.2026.2713250](https://doi.org/10.1080/24751839.2026.2713250).</w:t>
       </w:r>
     </w:p>
     <w:p>
@@ -6543,7 +6013,7 @@
           <w:rFonts w:ascii="Times New Roman" w:hAnsi="Times New Roman"/>
           <w:sz w:val="16"/>
         </w:rPr>
-        <w:t>[21] S. Chen, Y. Wang, J. Zhang, and H. Liu, "MultiPhishGuard: A multi-agent framework for robust phishing detection with role specialization," arXiv:2505.23803, 2025.</w:t>
+        <w:t>[21] L. Chen, M. Zaharia, and J. Zou, “FrugalGPT: How to use large language models while reducing cost and improving performance,” arXiv preprint arXiv:2305.05176, 2023. [Online]. Available: [https://arxiv.org/abs/2305.05176](https://arxiv.org/abs/2305.05176)</w:t>
       </w:r>
     </w:p>
     <w:p>
@@ -6557,7 +6027,7 @@
           <w:rFonts w:ascii="Times New Roman" w:hAnsi="Times New Roman"/>
           <w:sz w:val="16"/>
         </w:rPr>
-        <w:t>[22] E. Kim, A. Garg, K. Peng, and N. Garg, "Correlated errors in Large Language Models," arXiv:2506.07962, 2025.</w:t>
+        <w:t>[22] H. Mozannar and D. Sontag, “Consistent estimators for learning to defer to an expert,” in _International Conference on Machine Learning (ICML)_, 2020, pp. 7076–7087.</w:t>
       </w:r>
     </w:p>
     <w:p>
@@ -6571,7 +6041,7 @@
           <w:rFonts w:ascii="Times New Roman" w:hAnsi="Times New Roman"/>
           <w:sz w:val="16"/>
         </w:rPr>
-        <w:t>[23] A. Smit, P. Duckworth, N. Grinsztajn, T. D. Barrett, and A. Pretorius, "Should we be going MAD? A look at multi-agent debate strategies for LLMs," arXiv:2311.17371, 2024.</w:t>
+        <w:t>[23] C. K. Chow, “On optimum recognition error and reject option,” _IEEE Transactions on Information Theory_, vol. 16, no. 1, pp. 41–46, 1970. doi: [10.1109/TIT.1970.1054406](https://doi.org/10.1109/TIT.1970.1054406).</w:t>
       </w:r>
     </w:p>
     <w:p>
@@ -6585,7 +6055,7 @@
           <w:rFonts w:ascii="Times New Roman" w:hAnsi="Times New Roman"/>
           <w:sz w:val="16"/>
         </w:rPr>
-        <w:t>[24] K. K. Ladha, "The Condorcet Jury Theorem, free speech, and correlated votes," *American Journal of Political Science*, vol. 36, no. 3, pp. 617--634, 1992.</w:t>
+        <w:t>[24] C.-M. Chan, W. Chen, Y. Su, J. Xiao, Z. Liu, et al., “ChatEval: Towards better LLM-based evaluators through multi-agent debate,” in _International Conference on Learning Representations (ICLR)_, 2024.</w:t>
       </w:r>
     </w:p>
     <w:p>
@@ -6599,11 +6069,150 @@
           <w:rFonts w:ascii="Times New Roman" w:hAnsi="Times New Roman"/>
           <w:sz w:val="16"/>
         </w:rPr>
-        <w:t>[25] J. Wang, Q. Sun, X. Li, and M. Gao, "Boosting language models reasoning with chain-of-knowledge prompting," in *Proceedings of the 62nd Annual Meeting of the Association for Computational Linguistics (ACL)*, 2024, pp. 5014--5031.</w:t>
+        <w:t>[25] Y. Du, S. Li, A. Torralba, J. B. Tenenbaum, and I. Mordatch, “Improving factuality and reasoning in language models through multiagent debate,” in _International Conference on Machine Learning (ICML)_, 2024, pp. 8821–8840.</w:t>
+      </w:r>
+    </w:p>
+    <w:p>
+      <w:pPr>
+        <w:spacing w:after="40"/>
+        <w:ind w:left="288" w:hanging="288"/>
+        <w:jc w:val="both"/>
+      </w:pPr>
+      <w:r>
+        <w:rPr>
+          <w:rFonts w:ascii="Times New Roman" w:hAnsi="Times New Roman"/>
+          <w:sz w:val="16"/>
+        </w:rPr>
+        <w:t>[26] Yi-Nuo Xue, Eric Spero, Yun Sing Koh, and Giovanni Russello, “MultiPhishGuard: An Explainable and Adaptive Multi-Agent LLM System for Phishing Email Detection,” arXiv preprint arXiv:2505.23803v2, 2025. [Online]. Available: [https://arxiv.org/abs/2505.23803v2](https://arxiv.org/abs/2505.23803v2)</w:t>
+      </w:r>
+    </w:p>
+    <w:p>
+      <w:pPr>
+        <w:spacing w:after="40"/>
+        <w:ind w:left="288" w:hanging="288"/>
+        <w:jc w:val="both"/>
+      </w:pPr>
+      <w:r>
+        <w:rPr>
+          <w:rFonts w:ascii="Times New Roman" w:hAnsi="Times New Roman"/>
+          <w:sz w:val="16"/>
+        </w:rPr>
+        <w:t>[27] J. Wang, Q. Sun, X. Li, and M. Gao, “Boosting language models reasoning with Chain-of-Knowledge prompting,” in _Proceedings of the 62nd Annual Meeting of the Association for Computational Linguistics (Volume 1: Long Papers)_, Association for Computational Linguistics, 2024, pp. 5014–5031. doi: [10.18653/v1/2024.acl-long.271](https://doi.org/10.18653/v1/2024.acl-long.271).</w:t>
+      </w:r>
+    </w:p>
+    <w:p>
+      <w:pPr>
+        <w:spacing w:after="40"/>
+        <w:ind w:left="288" w:hanging="288"/>
+        <w:jc w:val="both"/>
+      </w:pPr>
+      <w:r>
+        <w:rPr>
+          <w:rFonts w:ascii="Times New Roman" w:hAnsi="Times New Roman"/>
+          <w:sz w:val="16"/>
+        </w:rPr>
+        <w:t>[28] P. Verga, S. Hofstatter, S. Althammer, Y. Su, A. Piktus, A. Arkhangorodsky, M. Xu, N. White, and P. Lewis, “Replacing judges with juries: Evaluating LLM generations with a panel of diverse models,” arXiv preprint arXiv:2404.18796, 2024. [Online]. Available: [https://arxiv.org/abs/2404.18796](https://arxiv.org/abs/2404.18796)</w:t>
+      </w:r>
+    </w:p>
+    <w:p>
+      <w:pPr>
+        <w:spacing w:after="40"/>
+        <w:ind w:left="288" w:hanging="288"/>
+        <w:jc w:val="both"/>
+      </w:pPr>
+      <w:r>
+        <w:rPr>
+          <w:rFonts w:ascii="Times New Roman" w:hAnsi="Times New Roman"/>
+          <w:sz w:val="16"/>
+        </w:rPr>
+        <w:t>[29] K. K. Ladha, “The Condorcet jury theorem, free speech, and correlated votes,” _American Journal of Political Science_, vol. 36, no. 3, pp. 617–634, 1992. doi: [10.2307/2111584](https://doi.org/10.2307/2111584).</w:t>
+      </w:r>
+    </w:p>
+    <w:p>
+      <w:pPr>
+        <w:spacing w:after="40"/>
+        <w:ind w:left="288" w:hanging="288"/>
+        <w:jc w:val="both"/>
+      </w:pPr>
+      <w:r>
+        <w:rPr>
+          <w:rFonts w:ascii="Times New Roman" w:hAnsi="Times New Roman"/>
+          <w:sz w:val="16"/>
+        </w:rPr>
+        <w:t>[30] E. Kim, A. Garg, K. Peng, and N. Garg, “Correlated errors in large language models,” arXiv preprint arXiv:2506.07962, 2025. [Online]. Available: [https://arxiv.org/abs/2506.07962](https://arxiv.org/abs/2506.07962)</w:t>
+      </w:r>
+    </w:p>
+    <w:p>
+      <w:pPr>
+        <w:spacing w:after="40"/>
+        <w:ind w:left="288" w:hanging="288"/>
+        <w:jc w:val="both"/>
+      </w:pPr>
+      <w:r>
+        <w:rPr>
+          <w:rFonts w:ascii="Times New Roman" w:hAnsi="Times New Roman"/>
+          <w:sz w:val="16"/>
+        </w:rPr>
+        <w:t>[31] A. Smit, P. Duckworth, N. Grinsztajn, T. D. Barrett, and A. Pretorius, “Should we be going MAD? A look at multi-agent debate strategies for LLMs,” arXiv preprint arXiv:2311.17371, 2024. [Online]. Available: [https://arxiv.org/abs/2311.17371](https://arxiv.org/abs/2311.17371)</w:t>
+      </w:r>
+    </w:p>
+    <w:p>
+      <w:pPr>
+        <w:spacing w:after="40"/>
+        <w:ind w:left="288" w:hanging="288"/>
+        <w:jc w:val="both"/>
+      </w:pPr>
+      <w:r>
+        <w:rPr>
+          <w:rFonts w:ascii="Times New Roman" w:hAnsi="Times New Roman"/>
+          <w:sz w:val="16"/>
+        </w:rPr>
+        <w:t>[32] F. Pedregosa, G. Varoquaux, A. Gramfort, V. Michel, B. Thirion, O. Grisel, M. Blondel, P. Prettenhofer, R. Weiss, V. Dubourg, J. Vanderplas, A. Passos, D. Cournapeau, M. Brucher, M. Perrot, and E. Duchesnay, “Scikit-learn: Machine learning in Python,” _Journal of Machine Learning Research_, vol. 12, pp. 2825–2830, 2011.</w:t>
+      </w:r>
+    </w:p>
+    <w:p>
+      <w:pPr>
+        <w:spacing w:after="40"/>
+        <w:ind w:left="288" w:hanging="288"/>
+        <w:jc w:val="both"/>
+      </w:pPr>
+      <w:r>
+        <w:rPr>
+          <w:rFonts w:ascii="Times New Roman" w:hAnsi="Times New Roman"/>
+          <w:sz w:val="16"/>
+        </w:rPr>
+        <w:t>[33] ONNX Runtime Developers, “ONNX Runtime: Cross-platform, high performance ML inferencing and training accelerator,” 2021. [Online]. Available: [https://onnxruntime.ai/](https://onnxruntime.ai/)</w:t>
+      </w:r>
+    </w:p>
+    <w:p>
+      <w:pPr>
+        <w:spacing w:after="40"/>
+        <w:ind w:left="288" w:hanging="288"/>
+        <w:jc w:val="both"/>
+      </w:pPr>
+      <w:r>
+        <w:rPr>
+          <w:rFonts w:ascii="Times New Roman" w:hAnsi="Times New Roman"/>
+          <w:sz w:val="16"/>
+        </w:rPr>
+        <w:t>[34] Q. McNemar, “Note on the sampling error of the difference between correlated proportions or percentages,” _Psychometrika_, vol. 12, no. 2, pp. 153–157, 1947. doi: [10.1007/BF02295996](https://doi.org/10.1007/BF02295996).</w:t>
+      </w:r>
+    </w:p>
+    <w:p>
+      <w:pPr>
+        <w:spacing w:after="40"/>
+        <w:ind w:left="288" w:hanging="288"/>
+        <w:jc w:val="both"/>
+      </w:pPr>
+      <w:r>
+        <w:rPr>
+          <w:rFonts w:ascii="Times New Roman" w:hAnsi="Times New Roman"/>
+          <w:sz w:val="16"/>
+        </w:rPr>
+        <w:t>[35] A. L. Edwards, “Note on the ‘correction for continuity’ in testing the significance of the difference between correlated proportions,” _Psychometrika_, vol. 13, no. 3, pp. 185–187, 1948. doi: [10.1007/BF02289261](https://doi.org/10.1007/BF02289261).</w:t>
       </w:r>
     </w:p>
     <w:sectPr>
-      <w:type w:val="continuous"/>
       <w:pgSz w:w="12240" w:h="15840"/>
       <w:pgMar w:top="1080" w:right="1080" w:bottom="1080" w:left="1080" w:header="720" w:footer="720" w:gutter="0"/>
       <w:cols w:space="450" w:num="2"/>

</xml_diff>